<commit_message>
docs(paper): add GRDI section 4.6, figures 7-8, and replay eval 5.5
Document chain-linked vs mutable collection semantics, GRDI 0.4 shadow
decision chain with TikZ pipeline figure, replay audit evaluation prose,
and refresh zenodo publish artifacts.

Co-authored-by: Cursor <cursoragent@cursor.com>
</commit_message>
<xml_diff>
--- a/paper/main.docx
+++ b/paper/main.docx
@@ -1218,7 +1218,7 @@
       </w:r>
     </w:p>
     <w:bookmarkEnd w:id="15"/>
-    <w:bookmarkStart w:id="35" w:name="sec:architecture"/>
+    <w:bookmarkStart w:id="41" w:name="sec:architecture"/>
     <w:p>
       <w:pPr>
         <w:pStyle w:val="Heading1"/>
@@ -1831,7 +1831,7 @@
       </w:r>
     </w:p>
     <w:bookmarkEnd w:id="19"/>
-    <w:bookmarkStart w:id="24" w:name="sec:transactional-ledger"/>
+    <w:bookmarkStart w:id="26" w:name="sec:transactional-ledger"/>
     <w:p>
       <w:pPr>
         <w:pStyle w:val="Heading2"/>
@@ -2662,8 +2662,214 @@
     </w:p>
     <w:bookmarkEnd w:id="22"/>
     <w:bookmarkEnd w:id="23"/>
+    <w:bookmarkStart w:id="25" w:name="chain-linked-versus-mutable-collections."/>
+    <w:p>
+      <w:pPr>
+        <w:pStyle w:val="Heading4"/>
+      </w:pPr>
+      <w:r>
+        <w:t xml:space="preserve">Chain-linked versus mutable collections.</w:t>
+      </w:r>
+    </w:p>
+    <w:p>
+      <w:pPr>
+        <w:pStyle w:val="FirstParagraph"/>
+      </w:pPr>
+      <w:r>
+        <w:t xml:space="preserve">GRDI persistence collections are</w:t>
+      </w:r>
+      <w:r>
+        <w:t xml:space="preserve"> </w:t>
+      </w:r>
+      <w:r>
+        <w:rPr>
+          <w:i/>
+          <w:iCs/>
+        </w:rPr>
+        <w:t xml:space="preserve">chain-linked</w:t>
+      </w:r>
+      <w:r>
+        <w:t xml:space="preserve">: each append extends a</w:t>
+      </w:r>
+      <w:r>
+        <w:t xml:space="preserve"> </w:t>
+      </w:r>
+      <w:r>
+        <w:t xml:space="preserve">per-scope hash chain and</w:t>
+      </w:r>
+      <w:r>
+        <w:t xml:space="preserve"> </w:t>
+      </w:r>
+      <w:r>
+        <w:rPr>
+          <w:rStyle w:val="VerbatimChar"/>
+        </w:rPr>
+        <w:t xml:space="preserve">compare_and_set_scoped</w:t>
+      </w:r>
+      <w:r>
+        <w:t xml:space="preserve"> </w:t>
+      </w:r>
+      <w:r>
+        <w:t xml:space="preserve">is rejected.</w:t>
+      </w:r>
+      <w:r>
+        <w:t xml:space="preserve"> </w:t>
+      </w:r>
+      <w:r>
+        <w:t xml:space="preserve">Core protocol collections (</w:t>
+      </w:r>
+      <w:r>
+        <w:rPr>
+          <w:rStyle w:val="VerbatimChar"/>
+        </w:rPr>
+        <w:t xml:space="preserve">claims</w:t>
+      </w:r>
+      <w:r>
+        <w:t xml:space="preserve">,</w:t>
+      </w:r>
+      <w:r>
+        <w:t xml:space="preserve"> </w:t>
+      </w:r>
+      <w:r>
+        <w:rPr>
+          <w:rStyle w:val="VerbatimChar"/>
+        </w:rPr>
+        <w:t xml:space="preserve">evidence</w:t>
+      </w:r>
+      <w:r>
+        <w:t xml:space="preserve">,</w:t>
+      </w:r>
+      <w:r>
+        <w:t xml:space="preserve"> </w:t>
+      </w:r>
+      <w:r>
+        <w:rPr>
+          <w:rStyle w:val="VerbatimChar"/>
+        </w:rPr>
+        <w:t xml:space="preserve">verifications</w:t>
+      </w:r>
+      <w:r>
+        <w:t xml:space="preserve">,</w:t>
+      </w:r>
+      <w:r>
+        <w:t xml:space="preserve"> </w:t>
+      </w:r>
+      <w:r>
+        <w:rPr>
+          <w:rStyle w:val="VerbatimChar"/>
+        </w:rPr>
+        <w:t xml:space="preserve">actions</w:t>
+      </w:r>
+      <w:r>
+        <w:t xml:space="preserve">,</w:t>
+      </w:r>
+      <w:r>
+        <w:t xml:space="preserve"> </w:t>
+      </w:r>
+      <w:r>
+        <w:rPr>
+          <w:rStyle w:val="VerbatimChar"/>
+        </w:rPr>
+        <w:t xml:space="preserve">policy_decisions</w:t>
+      </w:r>
+      <w:r>
+        <w:t xml:space="preserve">,</w:t>
+      </w:r>
+      <w:r>
+        <w:t xml:space="preserve"> </w:t>
+      </w:r>
+      <w:r>
+        <w:rPr>
+          <w:rStyle w:val="VerbatimChar"/>
+        </w:rPr>
+        <w:t xml:space="preserve">outcomes</w:t>
+      </w:r>
+      <w:r>
+        <w:t xml:space="preserve">) are stored as</w:t>
+      </w:r>
+      <w:r>
+        <w:t xml:space="preserve"> </w:t>
+      </w:r>
+      <w:r>
+        <w:rPr>
+          <w:i/>
+          <w:iCs/>
+        </w:rPr>
+        <w:t xml:space="preserve">mutable</w:t>
+      </w:r>
+      <w:r>
+        <w:t xml:space="preserve"> </w:t>
+      </w:r>
+      <w:r>
+        <w:t xml:space="preserve">scoped rows with standalone</w:t>
+      </w:r>
+      <w:r>
+        <w:t xml:space="preserve"> </w:t>
+      </w:r>
+      <w:r>
+        <w:t xml:space="preserve">content hashes and support conditional updates. Mixing the two modes in one</w:t>
+      </w:r>
+      <w:r>
+        <w:t xml:space="preserve"> </w:t>
+      </w:r>
+      <w:r>
+        <w:t xml:space="preserve">transaction is permitted, but a compare-and-set on a chain-linked collection</w:t>
+      </w:r>
+      <w:r>
+        <w:t xml:space="preserve"> </w:t>
+      </w:r>
+      <w:r>
+        <w:t xml:space="preserve">always fails closed. Figure </w:t>
+      </w:r>
+      <w:hyperlink w:anchor="fig:chain-mutable">
+        <w:r>
+          <w:rPr>
+            <w:rStyle w:val="Hyperlink"/>
+          </w:rPr>
+          <w:t xml:space="preserve">4</w:t>
+        </w:r>
+      </w:hyperlink>
+      <w:r>
+        <w:t xml:space="preserve"> </w:t>
+      </w:r>
+      <w:r>
+        <w:t xml:space="preserve">contrasts the two storage</w:t>
+      </w:r>
+      <w:r>
+        <w:t xml:space="preserve"> </w:t>
+      </w:r>
+      <w:r>
+        <w:t xml:space="preserve">semantics.</w:t>
+      </w:r>
+    </w:p>
+    <w:bookmarkStart w:id="24" w:name="fig:chain-mutable"/>
+    <w:tbl>
+      <w:tblPr>
+        <w:tblStyle w:val="FigureTable"/>
+        <w:tblW w:type="auto" w:w="0"/>
+        <w:jc w:val="center"/>
+        <w:tblLook w:firstRow="0" w:lastRow="0" w:firstColumn="0" w:lastColumn="0"/>
+      </w:tblPr>
+      <w:tblGrid/>
+    </w:tbl>
+    <w:p>
+      <w:pPr>
+        <w:pStyle w:val="ImageCaption"/>
+      </w:pPr>
+      <w:r>
+        <w:t xml:space="preserve">Chain-linked GRDI collections extend an append-only scoped hash chain;</w:t>
+      </w:r>
+      <w:r>
+        <w:t xml:space="preserve"> </w:t>
+      </w:r>
+      <w:r>
+        <w:t xml:space="preserve">mutable Core collections support conditional updates without chain linking.</w:t>
+      </w:r>
+    </w:p>
     <w:bookmarkEnd w:id="24"/>
-    <w:bookmarkStart w:id="25" w:name="policy-gated-runtime"/>
+    <w:bookmarkEnd w:id="25"/>
+    <w:bookmarkEnd w:id="26"/>
+    <w:bookmarkStart w:id="27" w:name="policy-gated-runtime"/>
     <w:p>
       <w:pPr>
         <w:pStyle w:val="Heading2"/>
@@ -3112,8 +3318,8 @@
         <w:t xml:space="preserve">deployment does not grant arbitrary external execution.</w:t>
       </w:r>
     </w:p>
-    <w:bookmarkEnd w:id="25"/>
-    <w:bookmarkStart w:id="26" w:name="api-sdk-and-operations"/>
+    <w:bookmarkEnd w:id="27"/>
+    <w:bookmarkStart w:id="28" w:name="api-sdk-and-operations"/>
     <w:p>
       <w:pPr>
         <w:pStyle w:val="Heading2"/>
@@ -3178,8 +3384,8 @@
         <w:t xml:space="preserve">tenant isolation or same-scope referential-integrity guarantees.</w:t>
       </w:r>
     </w:p>
-    <w:bookmarkEnd w:id="26"/>
-    <w:bookmarkStart w:id="34" w:name="sec:hav"/>
+    <w:bookmarkEnd w:id="28"/>
+    <w:bookmarkStart w:id="36" w:name="sec:hav"/>
     <w:p>
       <w:pPr>
         <w:pStyle w:val="Heading2"/>
@@ -3246,7 +3452,7 @@
         <w:t xml:space="preserve">or runtime described above; it is a client of that protocol.</w:t>
       </w:r>
     </w:p>
-    <w:bookmarkStart w:id="28" w:name="pipeline."/>
+    <w:bookmarkStart w:id="30" w:name="pipeline."/>
     <w:p>
       <w:pPr>
         <w:pStyle w:val="Heading4"/>
@@ -3376,7 +3582,7 @@
           <w:rPr>
             <w:rStyle w:val="Hyperlink"/>
           </w:rPr>
-          <w:t xml:space="preserve">4</w:t>
+          <w:t xml:space="preserve">5</w:t>
         </w:r>
       </w:hyperlink>
       <w:r>
@@ -3392,7 +3598,7 @@
         <w:t xml:space="preserve">pipeline from candidate output to ledger records.</w:t>
       </w:r>
     </w:p>
-    <w:bookmarkStart w:id="27" w:name="fig:hav-pipeline"/>
+    <w:bookmarkStart w:id="29" w:name="fig:hav-pipeline"/>
     <w:tbl>
       <w:tblPr>
         <w:tblStyle w:val="FigureTable"/>
@@ -3432,16 +3638,16 @@
           <w:rPr>
             <w:rStyle w:val="Hyperlink"/>
           </w:rPr>
-          <w:t xml:space="preserve">5</w:t>
+          <w:t xml:space="preserve">6</w:t>
         </w:r>
       </w:hyperlink>
       <w:r>
         <w:t xml:space="preserve">) maps to a blocking verdict.</w:t>
       </w:r>
     </w:p>
-    <w:bookmarkEnd w:id="27"/>
-    <w:bookmarkEnd w:id="28"/>
-    <w:bookmarkStart w:id="31" w:name="fail-closed-policy."/>
+    <w:bookmarkEnd w:id="29"/>
+    <w:bookmarkEnd w:id="30"/>
+    <w:bookmarkStart w:id="33" w:name="fail-closed-policy."/>
     <w:p>
       <w:pPr>
         <w:pStyle w:val="Heading4"/>
@@ -3523,7 +3729,7 @@
           <w:rPr>
             <w:rStyle w:val="Hyperlink"/>
           </w:rPr>
-          <w:t xml:space="preserve">5</w:t>
+          <w:t xml:space="preserve">6</w:t>
         </w:r>
       </w:hyperlink>
       <w:r>
@@ -3582,7 +3788,7 @@
         <w:t xml:space="preserve">defaulting to a permissive outcome.</w:t>
       </w:r>
     </w:p>
-    <w:bookmarkStart w:id="29" w:name="fig:hav-flow"/>
+    <w:bookmarkStart w:id="31" w:name="fig:hav-flow"/>
     <w:tbl>
       <w:tblPr>
         <w:tblStyle w:val="FigureTable"/>
@@ -3674,8 +3880,8 @@
         <w:t xml:space="preserve">condition fails.</w:t>
       </w:r>
     </w:p>
-    <w:bookmarkEnd w:id="29"/>
-    <w:bookmarkStart w:id="30" w:name="tab:hav-mapping"/>
+    <w:bookmarkEnd w:id="31"/>
+    <w:bookmarkStart w:id="32" w:name="tab:hav-mapping"/>
     <w:p>
       <w:pPr>
         <w:pStyle w:val="TableCaption"/>
@@ -3885,9 +4091,9 @@
         </w:tc>
       </w:tr>
     </w:tbl>
-    <w:bookmarkEnd w:id="30"/>
-    <w:bookmarkEnd w:id="31"/>
-    <w:bookmarkStart w:id="32" w:name="ledger-integration-and-receipts."/>
+    <w:bookmarkEnd w:id="32"/>
+    <w:bookmarkEnd w:id="33"/>
+    <w:bookmarkStart w:id="34" w:name="ledger-integration-and-receipts."/>
     <w:p>
       <w:pPr>
         <w:pStyle w:val="Heading4"/>
@@ -4059,8 +4265,8 @@
         <w:t xml:space="preserve">.</w:t>
       </w:r>
     </w:p>
-    <w:bookmarkEnd w:id="32"/>
-    <w:bookmarkStart w:id="33" w:name="security-posture."/>
+    <w:bookmarkEnd w:id="34"/>
+    <w:bookmarkStart w:id="35" w:name="security-posture."/>
     <w:p>
       <w:pPr>
         <w:pStyle w:val="Heading4"/>
@@ -4191,10 +4397,523 @@
         <w:t xml:space="preserve">on its own, and does not influence the policy decision above.</w:t>
       </w:r>
     </w:p>
-    <w:bookmarkEnd w:id="33"/>
-    <w:bookmarkEnd w:id="34"/>
     <w:bookmarkEnd w:id="35"/>
-    <w:bookmarkStart w:id="43" w:name="evaluation"/>
+    <w:bookmarkEnd w:id="36"/>
+    <w:bookmarkStart w:id="40" w:name="sec:grdi"/>
+    <w:p>
+      <w:pPr>
+        <w:pStyle w:val="Heading2"/>
+      </w:pPr>
+      <w:r>
+        <w:t xml:space="preserve">GRDI shadow decision chain</w:t>
+      </w:r>
+    </w:p>
+    <w:p>
+      <w:pPr>
+        <w:pStyle w:val="FirstParagraph"/>
+      </w:pPr>
+      <w:r>
+        <w:t xml:space="preserve">Governed Relational Decision Intelligence (GRDI) version 0.4.0 extends PhiGraph</w:t>
+      </w:r>
+      <w:r>
+        <w:t xml:space="preserve"> </w:t>
+      </w:r>
+      <w:r>
+        <w:t xml:space="preserve">with a persisted</w:t>
+      </w:r>
+      <w:r>
+        <w:t xml:space="preserve"> </w:t>
+      </w:r>
+      <w:r>
+        <w:rPr>
+          <w:i/>
+          <w:iCs/>
+        </w:rPr>
+        <w:t xml:space="preserve">shadow</w:t>
+      </w:r>
+      <w:r>
+        <w:t xml:space="preserve"> </w:t>
+      </w:r>
+      <w:r>
+        <w:t xml:space="preserve">decision chain that binds HAV verification,</w:t>
+      </w:r>
+      <w:r>
+        <w:t xml:space="preserve"> </w:t>
+      </w:r>
+      <w:r>
+        <w:t xml:space="preserve">human or policy authority, execution planning, simulated gateway decisions,</w:t>
+      </w:r>
+      <w:r>
+        <w:t xml:space="preserve"> </w:t>
+      </w:r>
+      <w:r>
+        <w:t xml:space="preserve">shadow receipts, outcomes, and deterministic replay audit. GRDI writes only</w:t>
+      </w:r>
+      <w:r>
+        <w:t xml:space="preserve"> </w:t>
+      </w:r>
+      <w:r>
+        <w:t xml:space="preserve">through the scoped transactional API in Section </w:t>
+      </w:r>
+      <w:hyperlink w:anchor="sec:transactional-ledger">
+        <w:r>
+          <w:rPr>
+            <w:rStyle w:val="Hyperlink"/>
+          </w:rPr>
+          <w:t xml:space="preserve">4.3</w:t>
+        </w:r>
+      </w:hyperlink>
+      <w:r>
+        <w:t xml:space="preserve"> </w:t>
+      </w:r>
+      <w:r>
+        <w:t xml:space="preserve">and never invokes external connectors or live executors in the current release.</w:t>
+      </w:r>
+    </w:p>
+    <w:bookmarkStart w:id="37" w:name="state-separation."/>
+    <w:p>
+      <w:pPr>
+        <w:pStyle w:val="Heading4"/>
+      </w:pPr>
+      <w:r>
+        <w:t xml:space="preserve">State separation.</w:t>
+      </w:r>
+    </w:p>
+    <w:p>
+      <w:pPr>
+        <w:pStyle w:val="FirstParagraph"/>
+      </w:pPr>
+      <w:r>
+        <w:t xml:space="preserve">Verification (</w:t>
+      </w:r>
+      <w:r>
+        <w:rPr>
+          <w:rStyle w:val="VerbatimChar"/>
+        </w:rPr>
+        <w:t xml:space="preserve">VERIFIED</w:t>
+      </w:r>
+      <w:r>
+        <w:t xml:space="preserve"> </w:t>
+      </w:r>
+      <w:r>
+        <w:t xml:space="preserve">/</w:t>
+      </w:r>
+      <w:r>
+        <w:t xml:space="preserve"> </w:t>
+      </w:r>
+      <w:r>
+        <w:rPr>
+          <w:rStyle w:val="VerbatimChar"/>
+        </w:rPr>
+        <w:t xml:space="preserve">NOT_VERIFIED</w:t>
+      </w:r>
+      <w:r>
+        <w:t xml:space="preserve">), authorization (</w:t>
+      </w:r>
+      <w:r>
+        <w:rPr>
+          <w:rStyle w:val="VerbatimChar"/>
+        </w:rPr>
+        <w:t xml:space="preserve">AUTHORIZED</w:t>
+      </w:r>
+      <w:r>
+        <w:t xml:space="preserve"> </w:t>
+      </w:r>
+      <w:r>
+        <w:t xml:space="preserve">/</w:t>
+      </w:r>
+      <w:r>
+        <w:t xml:space="preserve"> </w:t>
+      </w:r>
+      <w:r>
+        <w:rPr>
+          <w:rStyle w:val="VerbatimChar"/>
+        </w:rPr>
+        <w:t xml:space="preserve">NOT_AUTHORIZED</w:t>
+      </w:r>
+      <w:r>
+        <w:t xml:space="preserve"> </w:t>
+      </w:r>
+      <w:r>
+        <w:t xml:space="preserve">/</w:t>
+      </w:r>
+      <w:r>
+        <w:t xml:space="preserve"> </w:t>
+      </w:r>
+      <w:r>
+        <w:rPr>
+          <w:rStyle w:val="VerbatimChar"/>
+        </w:rPr>
+        <w:t xml:space="preserve">REQUIRES_APPROVAL</w:t>
+      </w:r>
+      <w:r>
+        <w:t xml:space="preserve">), and execution</w:t>
+      </w:r>
+      <w:r>
+        <w:t xml:space="preserve"> </w:t>
+      </w:r>
+      <w:r>
+        <w:t xml:space="preserve">(</w:t>
+      </w:r>
+      <w:r>
+        <w:rPr>
+          <w:rStyle w:val="VerbatimChar"/>
+        </w:rPr>
+        <w:t xml:space="preserve">NOT_EXECUTED</w:t>
+      </w:r>
+      <w:r>
+        <w:t xml:space="preserve"> </w:t>
+      </w:r>
+      <w:r>
+        <w:t xml:space="preserve">throughout Foundation and shadow increments) are</w:t>
+      </w:r>
+      <w:r>
+        <w:t xml:space="preserve"> </w:t>
+      </w:r>
+      <w:r>
+        <w:t xml:space="preserve">stored as distinct fields. A passing HAV receipt does not by itself authorize</w:t>
+      </w:r>
+      <w:r>
+        <w:t xml:space="preserve"> </w:t>
+      </w:r>
+      <w:r>
+        <w:t xml:space="preserve">an action; an authorized envelope does not imply that an external action was</w:t>
+      </w:r>
+      <w:r>
+        <w:t xml:space="preserve"> </w:t>
+      </w:r>
+      <w:r>
+        <w:t xml:space="preserve">executed. The shadow execution gateway may record</w:t>
+      </w:r>
+      <w:r>
+        <w:t xml:space="preserve"> </w:t>
+      </w:r>
+      <w:r>
+        <w:rPr>
+          <w:rStyle w:val="VerbatimChar"/>
+        </w:rPr>
+        <w:t xml:space="preserve">SIMULATED</w:t>
+      </w:r>
+      <w:r>
+        <w:t xml:space="preserve"> </w:t>
+      </w:r>
+      <w:r>
+        <w:t xml:space="preserve">plans and</w:t>
+      </w:r>
+      <w:r>
+        <w:t xml:space="preserve"> </w:t>
+      </w:r>
+      <w:r>
+        <w:t xml:space="preserve">signed receipts while preserving</w:t>
+      </w:r>
+      <w:r>
+        <w:t xml:space="preserve"> </w:t>
+      </w:r>
+      <w:r>
+        <w:rPr>
+          <w:rStyle w:val="VerbatimChar"/>
+        </w:rPr>
+        <w:t xml:space="preserve">execution_state=NOT_EXECUTED</w:t>
+      </w:r>
+      <w:r>
+        <w:t xml:space="preserve">.</w:t>
+      </w:r>
+    </w:p>
+    <w:bookmarkEnd w:id="37"/>
+    <w:bookmarkStart w:id="39" w:name="persisted-chain."/>
+    <w:p>
+      <w:pPr>
+        <w:pStyle w:val="Heading4"/>
+      </w:pPr>
+      <w:r>
+        <w:t xml:space="preserve">Persisted chain.</w:t>
+      </w:r>
+    </w:p>
+    <w:p>
+      <w:pPr>
+        <w:pStyle w:val="FirstParagraph"/>
+      </w:pPr>
+      <w:r>
+        <w:t xml:space="preserve">A typical shadow path appends, in order:</w:t>
+      </w:r>
+      <w:r>
+        <w:t xml:space="preserve"> </w:t>
+      </w:r>
+      <w:r>
+        <w:rPr>
+          <w:rStyle w:val="VerbatimChar"/>
+        </w:rPr>
+        <w:t xml:space="preserve">DecisionEnvelope</w:t>
+      </w:r>
+      <w:r>
+        <w:t xml:space="preserve"> </w:t>
+      </w:r>
+      <w:r>
+        <w:t xml:space="preserve">(HAV receipt and proposed action),</w:t>
+      </w:r>
+      <w:r>
+        <w:t xml:space="preserve"> </w:t>
+      </w:r>
+      <w:r>
+        <w:rPr>
+          <w:rStyle w:val="VerbatimChar"/>
+        </w:rPr>
+        <w:t xml:space="preserve">AuthorityDecision</w:t>
+      </w:r>
+      <w:r>
+        <w:t xml:space="preserve">,</w:t>
+      </w:r>
+      <w:r>
+        <w:t xml:space="preserve"> </w:t>
+      </w:r>
+      <w:r>
+        <w:rPr>
+          <w:rStyle w:val="VerbatimChar"/>
+        </w:rPr>
+        <w:t xml:space="preserve">ExecutionRequest</w:t>
+      </w:r>
+      <w:r>
+        <w:t xml:space="preserve">,</w:t>
+      </w:r>
+      <w:r>
+        <w:t xml:space="preserve"> </w:t>
+      </w:r>
+      <w:r>
+        <w:rPr>
+          <w:rStyle w:val="VerbatimChar"/>
+        </w:rPr>
+        <w:t xml:space="preserve">GatewayDecision</w:t>
+      </w:r>
+      <w:r>
+        <w:t xml:space="preserve">, optional</w:t>
+      </w:r>
+      <w:r>
+        <w:t xml:space="preserve"> </w:t>
+      </w:r>
+      <w:r>
+        <w:rPr>
+          <w:rStyle w:val="VerbatimChar"/>
+        </w:rPr>
+        <w:t xml:space="preserve">GatewayDecisionEvent</w:t>
+      </w:r>
+      <w:r>
+        <w:t xml:space="preserve">,</w:t>
+      </w:r>
+      <w:r>
+        <w:t xml:space="preserve"> </w:t>
+      </w:r>
+      <w:r>
+        <w:rPr>
+          <w:rStyle w:val="VerbatimChar"/>
+        </w:rPr>
+        <w:t xml:space="preserve">ShadowExecutionReceipt</w:t>
+      </w:r>
+      <w:r>
+        <w:t xml:space="preserve">, and</w:t>
+      </w:r>
+      <w:r>
+        <w:t xml:space="preserve"> </w:t>
+      </w:r>
+      <w:r>
+        <w:rPr>
+          <w:rStyle w:val="VerbatimChar"/>
+        </w:rPr>
+        <w:t xml:space="preserve">ShadowOutcomeRecord</w:t>
+      </w:r>
+      <w:r>
+        <w:t xml:space="preserve">. Replay</w:t>
+      </w:r>
+      <w:r>
+        <w:t xml:space="preserve"> </w:t>
+      </w:r>
+      <w:r>
+        <w:t xml:space="preserve">audit appends</w:t>
+      </w:r>
+      <w:r>
+        <w:t xml:space="preserve"> </w:t>
+      </w:r>
+      <w:r>
+        <w:rPr>
+          <w:rStyle w:val="VerbatimChar"/>
+        </w:rPr>
+        <w:t xml:space="preserve">ReplayReport</w:t>
+      </w:r>
+      <w:r>
+        <w:t xml:space="preserve"> </w:t>
+      </w:r>
+      <w:r>
+        <w:t xml:space="preserve">and</w:t>
+      </w:r>
+      <w:r>
+        <w:t xml:space="preserve"> </w:t>
+      </w:r>
+      <w:r>
+        <w:rPr>
+          <w:rStyle w:val="VerbatimChar"/>
+        </w:rPr>
+        <w:t xml:space="preserve">HistoricalComparison</w:t>
+      </w:r>
+      <w:r>
+        <w:t xml:space="preserve"> </w:t>
+      </w:r>
+      <w:r>
+        <w:t xml:space="preserve">records that re-verify the stored chain without re-running simulation or</w:t>
+      </w:r>
+      <w:r>
+        <w:t xml:space="preserve"> </w:t>
+      </w:r>
+      <w:r>
+        <w:t xml:space="preserve">authority evaluation. Invalid signatures, scope mismatches, or broken links</w:t>
+      </w:r>
+      <w:r>
+        <w:t xml:space="preserve"> </w:t>
+      </w:r>
+      <w:r>
+        <w:t xml:space="preserve">fail closed into explicit</w:t>
+      </w:r>
+      <w:r>
+        <w:t xml:space="preserve"> </w:t>
+      </w:r>
+      <w:r>
+        <w:rPr>
+          <w:rStyle w:val="VerbatimChar"/>
+        </w:rPr>
+        <w:t xml:space="preserve">INVALID</w:t>
+      </w:r>
+      <w:r>
+        <w:t xml:space="preserve"> </w:t>
+      </w:r>
+      <w:r>
+        <w:t xml:space="preserve">or</w:t>
+      </w:r>
+      <w:r>
+        <w:t xml:space="preserve"> </w:t>
+      </w:r>
+      <w:r>
+        <w:rPr>
+          <w:rStyle w:val="VerbatimChar"/>
+        </w:rPr>
+        <w:t xml:space="preserve">INCOMPLETE</w:t>
+      </w:r>
+      <w:r>
+        <w:t xml:space="preserve"> </w:t>
+      </w:r>
+      <w:r>
+        <w:t xml:space="preserve">replay</w:t>
+      </w:r>
+      <w:r>
+        <w:t xml:space="preserve"> </w:t>
+      </w:r>
+      <w:r>
+        <w:t xml:space="preserve">states; replay never calls chain repair routines.</w:t>
+      </w:r>
+    </w:p>
+    <w:p>
+      <w:pPr>
+        <w:pStyle w:val="BodyText"/>
+      </w:pPr>
+      <w:r>
+        <w:t xml:space="preserve">Figure </w:t>
+      </w:r>
+      <w:hyperlink w:anchor="fig:grdi-pipeline">
+        <w:r>
+          <w:rPr>
+            <w:rStyle w:val="Hyperlink"/>
+          </w:rPr>
+          <w:t xml:space="preserve">7</w:t>
+        </w:r>
+      </w:hyperlink>
+      <w:r>
+        <w:t xml:space="preserve"> </w:t>
+      </w:r>
+      <w:r>
+        <w:t xml:space="preserve">shows the end-to-end shadow flow implemented</w:t>
+      </w:r>
+      <w:r>
+        <w:t xml:space="preserve"> </w:t>
+      </w:r>
+      <w:r>
+        <w:t xml:space="preserve">on</w:t>
+      </w:r>
+      <w:r>
+        <w:t xml:space="preserve"> </w:t>
+      </w:r>
+      <w:r>
+        <w:rPr>
+          <w:rStyle w:val="VerbatimChar"/>
+        </w:rPr>
+        <w:t xml:space="preserve">main</w:t>
+      </w:r>
+      <w:r>
+        <w:t xml:space="preserve"> </w:t>
+      </w:r>
+      <w:r>
+        <w:t xml:space="preserve">at Core 4.1.0-rc.6. External execution and PostgreSQL-scoped</w:t>
+      </w:r>
+      <w:r>
+        <w:t xml:space="preserve"> </w:t>
+      </w:r>
+      <w:r>
+        <w:t xml:space="preserve">transactions remain</w:t>
+      </w:r>
+      <w:r>
+        <w:t xml:space="preserve"> </w:t>
+      </w:r>
+      <w:r>
+        <w:rPr>
+          <w:i/>
+          <w:iCs/>
+        </w:rPr>
+        <w:t xml:space="preserve">specified</w:t>
+      </w:r>
+      <w:r>
+        <w:t xml:space="preserve"> </w:t>
+      </w:r>
+      <w:r>
+        <w:t xml:space="preserve">future work, not claims of this paper.</w:t>
+      </w:r>
+    </w:p>
+    <w:bookmarkStart w:id="38" w:name="fig:grdi-pipeline"/>
+    <w:tbl>
+      <w:tblPr>
+        <w:tblStyle w:val="FigureTable"/>
+        <w:tblW w:type="auto" w:w="0"/>
+        <w:jc w:val="center"/>
+        <w:tblLook w:firstRow="0" w:lastRow="0" w:firstColumn="0" w:lastColumn="0"/>
+      </w:tblPr>
+      <w:tblGrid/>
+    </w:tbl>
+    <w:p>
+      <w:pPr>
+        <w:pStyle w:val="ImageCaption"/>
+      </w:pPr>
+      <w:r>
+        <w:t xml:space="preserve">GRDI 0.4.0 shadow decision chain. Each box is an append-only,</w:t>
+      </w:r>
+      <w:r>
+        <w:t xml:space="preserve"> </w:t>
+      </w:r>
+      <w:r>
+        <w:t xml:space="preserve">scope-tagged ledger collection linked through the transactional store.</w:t>
+      </w:r>
+      <w:r>
+        <w:t xml:space="preserve"> </w:t>
+      </w:r>
+      <w:r>
+        <w:t xml:space="preserve">Replay audit reads and verifies history without invoking connectors or</w:t>
+      </w:r>
+      <w:r>
+        <w:t xml:space="preserve"> </w:t>
+      </w:r>
+      <w:r>
+        <w:t xml:space="preserve">re-running simulation.</w:t>
+      </w:r>
+    </w:p>
+    <w:bookmarkEnd w:id="38"/>
+    <w:bookmarkEnd w:id="39"/>
+    <w:bookmarkEnd w:id="40"/>
+    <w:bookmarkEnd w:id="41"/>
+    <w:bookmarkStart w:id="50" w:name="evaluation"/>
     <w:p>
       <w:pPr>
         <w:pStyle w:val="Heading1"/>
@@ -4203,7 +4922,7 @@
         <w:t xml:space="preserve">Evaluation</w:t>
       </w:r>
     </w:p>
-    <w:bookmarkStart w:id="36" w:name="research-questions"/>
+    <w:bookmarkStart w:id="42" w:name="research-questions"/>
     <w:p>
       <w:pPr>
         <w:pStyle w:val="Heading2"/>
@@ -4306,8 +5025,8 @@
         <w:t xml:space="preserve">corpus.</w:t>
       </w:r>
     </w:p>
-    <w:bookmarkEnd w:id="36"/>
-    <w:bookmarkStart w:id="37" w:name="software-verification"/>
+    <w:bookmarkEnd w:id="42"/>
+    <w:bookmarkStart w:id="43" w:name="software-verification"/>
     <w:p>
       <w:pPr>
         <w:pStyle w:val="Heading2"/>
@@ -4429,8 +5148,8 @@
         <w:t xml:space="preserve">deployments.</w:t>
       </w:r>
     </w:p>
-    <w:bookmarkEnd w:id="37"/>
-    <w:bookmarkStart w:id="38" w:name="sec:hav-scenarios"/>
+    <w:bookmarkEnd w:id="43"/>
+    <w:bookmarkStart w:id="44" w:name="sec:hav-scenarios"/>
     <w:p>
       <w:pPr>
         <w:pStyle w:val="Heading2"/>
@@ -4605,8 +5324,8 @@
         <w:t xml:space="preserve">to generalize beyond the repository-status vocabulary encoded in its rules.</w:t>
       </w:r>
     </w:p>
-    <w:bookmarkEnd w:id="38"/>
-    <w:bookmarkStart w:id="39" w:name="sec:txn-eval"/>
+    <w:bookmarkEnd w:id="44"/>
+    <w:bookmarkStart w:id="45" w:name="sec:txn-eval"/>
     <w:p>
       <w:pPr>
         <w:pStyle w:val="Heading2"/>
@@ -4713,8 +5432,99 @@
         <w:t xml:space="preserve">unrestricted storage access.</w:t>
       </w:r>
     </w:p>
-    <w:bookmarkEnd w:id="39"/>
-    <w:bookmarkStart w:id="42" w:name="external-anomaly-ranking-experiment"/>
+    <w:bookmarkEnd w:id="45"/>
+    <w:bookmarkStart w:id="46" w:name="sec:grdi-eval"/>
+    <w:p>
+      <w:pPr>
+        <w:pStyle w:val="Heading2"/>
+      </w:pPr>
+      <w:r>
+        <w:t xml:space="preserve">GRDI replay audit scenarios</w:t>
+      </w:r>
+    </w:p>
+    <w:p>
+      <w:pPr>
+        <w:pStyle w:val="FirstParagraph"/>
+      </w:pPr>
+      <w:r>
+        <w:t xml:space="preserve">GRDI replay and historical-comparison modules are covered by automated tests</w:t>
+      </w:r>
+      <w:r>
+        <w:t xml:space="preserve"> </w:t>
+      </w:r>
+      <w:r>
+        <w:t xml:space="preserve">that rebuild manifest hashes from persisted shadow records, reject tampered</w:t>
+      </w:r>
+      <w:r>
+        <w:t xml:space="preserve"> </w:t>
+      </w:r>
+      <w:r>
+        <w:t xml:space="preserve">receipt links, and assert explicit non-execution invariants</w:t>
+      </w:r>
+      <w:r>
+        <w:t xml:space="preserve"> </w:t>
+      </w:r>
+      <w:r>
+        <w:t xml:space="preserve">(</w:t>
+      </w:r>
+      <w:r>
+        <w:rPr>
+          <w:rStyle w:val="VerbatimChar"/>
+        </w:rPr>
+        <w:t xml:space="preserve">replay_executed=false</w:t>
+      </w:r>
+      <w:r>
+        <w:t xml:space="preserve">,</w:t>
+      </w:r>
+      <w:r>
+        <w:t xml:space="preserve"> </w:t>
+      </w:r>
+      <w:r>
+        <w:rPr>
+          <w:rStyle w:val="VerbatimChar"/>
+        </w:rPr>
+        <w:t xml:space="preserve">connector_invoked=false</w:t>
+      </w:r>
+      <w:r>
+        <w:t xml:space="preserve">).</w:t>
+      </w:r>
+      <w:r>
+        <w:t xml:space="preserve"> </w:t>
+      </w:r>
+      <w:r>
+        <w:t xml:space="preserve">These tests confirm</w:t>
+      </w:r>
+      <w:r>
+        <w:t xml:space="preserve"> </w:t>
+      </w:r>
+      <w:r>
+        <w:rPr>
+          <w:i/>
+          <w:iCs/>
+        </w:rPr>
+        <w:t xml:space="preserve">implemented</w:t>
+      </w:r>
+      <w:r>
+        <w:t xml:space="preserve"> </w:t>
+      </w:r>
+      <w:r>
+        <w:t xml:space="preserve">read-only audit behavior on JSON and</w:t>
+      </w:r>
+      <w:r>
+        <w:t xml:space="preserve"> </w:t>
+      </w:r>
+      <w:r>
+        <w:t xml:space="preserve">SQLite backends; they do not establish causal correctness of shadow</w:t>
+      </w:r>
+      <w:r>
+        <w:t xml:space="preserve"> </w:t>
+      </w:r>
+      <w:r>
+        <w:t xml:space="preserve">simulations or semantic equivalence between production deployments.</w:t>
+      </w:r>
+    </w:p>
+    <w:bookmarkEnd w:id="46"/>
+    <w:bookmarkStart w:id="49" w:name="external-anomaly-ranking-experiment"/>
     <w:p>
       <w:pPr>
         <w:pStyle w:val="Heading2"/>
@@ -4819,7 +5629,7 @@
         <w:t xml:space="preserve">reproduces the committed result.</w:t>
       </w:r>
     </w:p>
-    <w:bookmarkStart w:id="40" w:name="tab:cicids"/>
+    <w:bookmarkStart w:id="47" w:name="tab:cicids"/>
     <w:p>
       <w:pPr>
         <w:pStyle w:val="TableCaption"/>
@@ -5290,8 +6100,8 @@
         </w:tc>
       </w:tr>
     </w:tbl>
-    <w:bookmarkEnd w:id="40"/>
-    <w:bookmarkStart w:id="41" w:name="fig:cicids-bars"/>
+    <w:bookmarkEnd w:id="47"/>
+    <w:bookmarkStart w:id="48" w:name="fig:cicids-bars"/>
     <w:tbl>
       <w:tblPr>
         <w:tblStyle w:val="FigureTable"/>
@@ -5338,7 +6148,7 @@
         <w:t xml:space="preserve">second, ahead of Isolation Forest and robust deviation.</w:t>
       </w:r>
     </w:p>
-    <w:bookmarkEnd w:id="41"/>
+    <w:bookmarkEnd w:id="48"/>
     <w:p>
       <w:pPr>
         <w:pStyle w:val="BodyText"/>
@@ -5371,9 +6181,9 @@
         <w:t xml:space="preserve">claim of general or state-of-the-art superiority.</w:t>
       </w:r>
     </w:p>
-    <w:bookmarkEnd w:id="42"/>
-    <w:bookmarkEnd w:id="43"/>
-    <w:bookmarkStart w:id="49" w:name="threats-to-validity-and-limitations"/>
+    <w:bookmarkEnd w:id="49"/>
+    <w:bookmarkEnd w:id="50"/>
+    <w:bookmarkStart w:id="56" w:name="threats-to-validity-and-limitations"/>
     <w:p>
       <w:pPr>
         <w:pStyle w:val="Heading1"/>
@@ -5382,7 +6192,7 @@
         <w:t xml:space="preserve">Threats to Validity and Limitations</w:t>
       </w:r>
     </w:p>
-    <w:bookmarkStart w:id="44" w:name="dataset-validity."/>
+    <w:bookmarkStart w:id="51" w:name="dataset-validity."/>
     <w:p>
       <w:pPr>
         <w:pStyle w:val="Heading4"/>
@@ -5438,8 +6248,8 @@
         <w:t xml:space="preserve">graph for which PhiGraph is designed.</w:t>
       </w:r>
     </w:p>
-    <w:bookmarkEnd w:id="44"/>
-    <w:bookmarkStart w:id="45" w:name="experimental-validity."/>
+    <w:bookmarkEnd w:id="51"/>
+    <w:bookmarkStart w:id="52" w:name="experimental-validity."/>
     <w:p>
       <w:pPr>
         <w:pStyle w:val="Heading4"/>
@@ -5504,8 +6314,8 @@
         <w:t xml:space="preserve">are required.</w:t>
       </w:r>
     </w:p>
-    <w:bookmarkEnd w:id="45"/>
-    <w:bookmarkStart w:id="46" w:name="software-validity."/>
+    <w:bookmarkEnd w:id="52"/>
+    <w:bookmarkStart w:id="53" w:name="software-validity."/>
     <w:p>
       <w:pPr>
         <w:pStyle w:val="Heading4"/>
@@ -5552,8 +6362,8 @@
         <w:t xml:space="preserve">storage, secrets management, authorization, monitoring, and backup procedures.</w:t>
       </w:r>
     </w:p>
-    <w:bookmarkEnd w:id="46"/>
-    <w:bookmarkStart w:id="47" w:name="hav-validity."/>
+    <w:bookmarkEnd w:id="53"/>
+    <w:bookmarkStart w:id="54" w:name="hav-validity."/>
     <w:p>
       <w:pPr>
         <w:pStyle w:val="Heading4"/>
@@ -5644,8 +6454,8 @@
         <w:t xml:space="preserve">documented as an auxiliary signal rather than proof of factual agreement.</w:t>
       </w:r>
     </w:p>
-    <w:bookmarkEnd w:id="47"/>
-    <w:bookmarkStart w:id="48" w:name="causal-and-governance-claims."/>
+    <w:bookmarkEnd w:id="54"/>
+    <w:bookmarkStart w:id="55" w:name="causal-and-governance-claims."/>
     <w:p>
       <w:pPr>
         <w:pStyle w:val="Heading4"/>
@@ -5692,9 +6502,9 @@
         <w:t xml:space="preserve">legal, or correct outcomes.</w:t>
       </w:r>
     </w:p>
-    <w:bookmarkEnd w:id="48"/>
-    <w:bookmarkEnd w:id="49"/>
-    <w:bookmarkStart w:id="52" w:name="reproducibility-and-availability"/>
+    <w:bookmarkEnd w:id="55"/>
+    <w:bookmarkEnd w:id="56"/>
+    <w:bookmarkStart w:id="59" w:name="reproducibility-and-availability"/>
     <w:p>
       <w:pPr>
         <w:pStyle w:val="Heading1"/>
@@ -5719,7 +6529,7 @@
       <w:r>
         <w:t xml:space="preserve"> </w:t>
       </w:r>
-      <w:hyperlink r:id="rId50">
+      <w:hyperlink r:id="rId57">
         <w:r>
           <w:rPr>
             <w:rStyle w:val="Hyperlink"/>
@@ -5733,7 +6543,7 @@
       <w:r>
         <w:t xml:space="preserve"> </w:t>
       </w:r>
-      <w:hyperlink r:id="rId51">
+      <w:hyperlink r:id="rId58">
         <w:r>
           <w:rPr>
             <w:rStyle w:val="Hyperlink"/>
@@ -5908,7 +6718,7 @@
       <w:r>
         <w:t xml:space="preserve"> </w:t>
       </w:r>
-      <w:hyperlink r:id="rId51">
+      <w:hyperlink r:id="rId58">
         <w:r>
           <w:rPr>
             <w:rStyle w:val="Hyperlink"/>
@@ -5920,8 +6730,8 @@
         <w:t xml:space="preserve">.</w:t>
       </w:r>
     </w:p>
-    <w:bookmarkEnd w:id="52"/>
-    <w:bookmarkStart w:id="53" w:name="ethical-and-operational-considerations"/>
+    <w:bookmarkEnd w:id="59"/>
+    <w:bookmarkStart w:id="60" w:name="ethical-and-operational-considerations"/>
     <w:p>
       <w:pPr>
         <w:pStyle w:val="Heading1"/>
@@ -5986,8 +6796,8 @@
         <w:t xml:space="preserve">finance, health, or critical infrastructure.</w:t>
       </w:r>
     </w:p>
-    <w:bookmarkEnd w:id="53"/>
-    <w:bookmarkStart w:id="54" w:name="conclusion"/>
+    <w:bookmarkEnd w:id="60"/>
+    <w:bookmarkStart w:id="61" w:name="conclusion"/>
     <w:p>
       <w:pPr>
         <w:pStyle w:val="Heading1"/>
@@ -6100,8 +6910,8 @@
         <w:t xml:space="preserve">anchored audit storage, and prospective shadow deployments.</w:t>
       </w:r>
     </w:p>
-    <w:bookmarkEnd w:id="54"/>
-    <w:bookmarkStart w:id="55" w:name="author-contributions"/>
+    <w:bookmarkEnd w:id="61"/>
+    <w:bookmarkStart w:id="62" w:name="author-contributions"/>
     <w:p>
       <w:pPr>
         <w:pStyle w:val="Heading1"/>
@@ -6130,8 +6940,8 @@
         <w:t xml:space="preserve">manuscript.</w:t>
       </w:r>
     </w:p>
-    <w:bookmarkEnd w:id="55"/>
-    <w:bookmarkStart w:id="56" w:name="conflict-of-interest"/>
+    <w:bookmarkEnd w:id="62"/>
+    <w:bookmarkStart w:id="63" w:name="conflict-of-interest"/>
     <w:p>
       <w:pPr>
         <w:pStyle w:val="Heading1"/>
@@ -6160,8 +6970,8 @@
         <w:t xml:space="preserve">The evaluation and limitations are reported to enable independent scrutiny.</w:t>
       </w:r>
     </w:p>
-    <w:bookmarkEnd w:id="56"/>
-    <w:bookmarkStart w:id="82" w:name="license"/>
+    <w:bookmarkEnd w:id="63"/>
+    <w:bookmarkStart w:id="89" w:name="license"/>
     <w:p>
       <w:pPr>
         <w:pStyle w:val="Heading1"/>
@@ -6184,8 +6994,8 @@
         <w:t xml:space="preserve">International License (CC BY 4.0).</w:t>
       </w:r>
     </w:p>
-    <w:bookmarkStart w:id="81" w:name="refs"/>
-    <w:bookmarkStart w:id="58" w:name="ref-battaglia2018relational"/>
+    <w:bookmarkStart w:id="88" w:name="refs"/>
+    <w:bookmarkStart w:id="65" w:name="ref-battaglia2018relational"/>
     <w:p>
       <w:pPr>
         <w:pStyle w:val="Bibliography"/>
@@ -6218,7 +7028,7 @@
       <w:r>
         <w:t xml:space="preserve"> </w:t>
       </w:r>
-      <w:hyperlink r:id="rId57">
+      <w:hyperlink r:id="rId64">
         <w:r>
           <w:rPr>
             <w:rStyle w:val="Hyperlink"/>
@@ -6230,8 +7040,8 @@
         <w:t xml:space="preserve">.</w:t>
       </w:r>
     </w:p>
-    <w:bookmarkEnd w:id="58"/>
-    <w:bookmarkStart w:id="60" w:name="ref-gebru2021datasheets"/>
+    <w:bookmarkEnd w:id="65"/>
+    <w:bookmarkStart w:id="67" w:name="ref-gebru2021datasheets"/>
     <w:p>
       <w:pPr>
         <w:pStyle w:val="Bibliography"/>
@@ -6264,7 +7074,7 @@
       <w:r>
         <w:t xml:space="preserve"> </w:t>
       </w:r>
-      <w:hyperlink r:id="rId59">
+      <w:hyperlink r:id="rId66">
         <w:r>
           <w:rPr>
             <w:rStyle w:val="Hyperlink"/>
@@ -6276,8 +7086,8 @@
         <w:t xml:space="preserve">.</w:t>
       </w:r>
     </w:p>
-    <w:bookmarkEnd w:id="60"/>
-    <w:bookmarkStart w:id="62" w:name="ref-ji2023hallucination"/>
+    <w:bookmarkEnd w:id="67"/>
+    <w:bookmarkStart w:id="69" w:name="ref-ji2023hallucination"/>
     <w:p>
       <w:pPr>
         <w:pStyle w:val="Bibliography"/>
@@ -6310,7 +7120,7 @@
       <w:r>
         <w:t xml:space="preserve"> </w:t>
       </w:r>
-      <w:hyperlink r:id="rId61">
+      <w:hyperlink r:id="rId68">
         <w:r>
           <w:rPr>
             <w:rStyle w:val="Hyperlink"/>
@@ -6322,8 +7132,8 @@
         <w:t xml:space="preserve">.</w:t>
       </w:r>
     </w:p>
-    <w:bookmarkEnd w:id="62"/>
-    <w:bookmarkStart w:id="64" w:name="ref-lanvin2022errors"/>
+    <w:bookmarkEnd w:id="69"/>
+    <w:bookmarkStart w:id="71" w:name="ref-lanvin2022errors"/>
     <w:p>
       <w:pPr>
         <w:pStyle w:val="Bibliography"/>
@@ -6365,7 +7175,7 @@
       <w:r>
         <w:t xml:space="preserve"> </w:t>
       </w:r>
-      <w:hyperlink r:id="rId63">
+      <w:hyperlink r:id="rId70">
         <w:r>
           <w:rPr>
             <w:rStyle w:val="Hyperlink"/>
@@ -6377,8 +7187,8 @@
         <w:t xml:space="preserve">.</w:t>
       </w:r>
     </w:p>
-    <w:bookmarkEnd w:id="64"/>
-    <w:bookmarkStart w:id="66" w:name="ref-lebo2013provo"/>
+    <w:bookmarkEnd w:id="71"/>
+    <w:bookmarkStart w:id="73" w:name="ref-lebo2013provo"/>
     <w:p>
       <w:pPr>
         <w:pStyle w:val="Bibliography"/>
@@ -6437,7 +7247,7 @@
       <w:r>
         <w:t xml:space="preserve"> </w:t>
       </w:r>
-      <w:hyperlink r:id="rId65">
+      <w:hyperlink r:id="rId72">
         <w:r>
           <w:rPr>
             <w:rStyle w:val="Hyperlink"/>
@@ -6449,8 +7259,8 @@
         <w:t xml:space="preserve">.</w:t>
       </w:r>
     </w:p>
-    <w:bookmarkEnd w:id="66"/>
-    <w:bookmarkStart w:id="68" w:name="ref-liu2022errors"/>
+    <w:bookmarkEnd w:id="73"/>
+    <w:bookmarkStart w:id="75" w:name="ref-liu2022errors"/>
     <w:p>
       <w:pPr>
         <w:pStyle w:val="Bibliography"/>
@@ -6513,7 +7323,7 @@
       <w:r>
         <w:t xml:space="preserve"> </w:t>
       </w:r>
-      <w:hyperlink r:id="rId67">
+      <w:hyperlink r:id="rId74">
         <w:r>
           <w:rPr>
             <w:rStyle w:val="Hyperlink"/>
@@ -6525,8 +7335,8 @@
         <w:t xml:space="preserve">.</w:t>
       </w:r>
     </w:p>
-    <w:bookmarkEnd w:id="68"/>
-    <w:bookmarkStart w:id="70" w:name="ref-mitchell2019modelcards"/>
+    <w:bookmarkEnd w:id="75"/>
+    <w:bookmarkStart w:id="77" w:name="ref-mitchell2019modelcards"/>
     <w:p>
       <w:pPr>
         <w:pStyle w:val="Bibliography"/>
@@ -6556,7 +7366,7 @@
       <w:r>
         <w:t xml:space="preserve"> </w:t>
       </w:r>
-      <w:hyperlink r:id="rId69">
+      <w:hyperlink r:id="rId76">
         <w:r>
           <w:rPr>
             <w:rStyle w:val="Hyperlink"/>
@@ -6568,8 +7378,8 @@
         <w:t xml:space="preserve">.</w:t>
       </w:r>
     </w:p>
-    <w:bookmarkEnd w:id="70"/>
-    <w:bookmarkStart w:id="72" w:name="ref-owasp2025agentic"/>
+    <w:bookmarkEnd w:id="77"/>
+    <w:bookmarkStart w:id="79" w:name="ref-owasp2025agentic"/>
     <w:p>
       <w:pPr>
         <w:pStyle w:val="Bibliography"/>
@@ -6593,7 +7403,7 @@
       <w:r>
         <w:t xml:space="preserve"> </w:t>
       </w:r>
-      <w:hyperlink r:id="rId71">
+      <w:hyperlink r:id="rId78">
         <w:r>
           <w:rPr>
             <w:rStyle w:val="Hyperlink"/>
@@ -6605,8 +7415,8 @@
         <w:t xml:space="preserve">.</w:t>
       </w:r>
     </w:p>
-    <w:bookmarkEnd w:id="72"/>
-    <w:bookmarkStart w:id="74" w:name="ref-sharafaldin2018cicids"/>
+    <w:bookmarkEnd w:id="79"/>
+    <w:bookmarkStart w:id="81" w:name="ref-sharafaldin2018cicids"/>
     <w:p>
       <w:pPr>
         <w:pStyle w:val="Bibliography"/>
@@ -6636,7 +7446,7 @@
       <w:r>
         <w:t xml:space="preserve"> </w:t>
       </w:r>
-      <w:hyperlink r:id="rId73">
+      <w:hyperlink r:id="rId80">
         <w:r>
           <w:rPr>
             <w:rStyle w:val="Hyperlink"/>
@@ -6648,8 +7458,8 @@
         <w:t xml:space="preserve">.</w:t>
       </w:r>
     </w:p>
-    <w:bookmarkEnd w:id="74"/>
-    <w:bookmarkStart w:id="76" w:name="ref-nist2023airmf"/>
+    <w:bookmarkEnd w:id="81"/>
+    <w:bookmarkStart w:id="83" w:name="ref-nist2023airmf"/>
     <w:p>
       <w:pPr>
         <w:pStyle w:val="Bibliography"/>
@@ -6694,7 +7504,7 @@
       <w:r>
         <w:t xml:space="preserve"> </w:t>
       </w:r>
-      <w:hyperlink r:id="rId75">
+      <w:hyperlink r:id="rId82">
         <w:r>
           <w:rPr>
             <w:rStyle w:val="Hyperlink"/>
@@ -6706,8 +7516,8 @@
         <w:t xml:space="preserve">.</w:t>
       </w:r>
     </w:p>
-    <w:bookmarkEnd w:id="76"/>
-    <w:bookmarkStart w:id="78" w:name="ref-thorne2018fever"/>
+    <w:bookmarkEnd w:id="83"/>
+    <w:bookmarkStart w:id="85" w:name="ref-thorne2018fever"/>
     <w:p>
       <w:pPr>
         <w:pStyle w:val="Bibliography"/>
@@ -6752,7 +7562,7 @@
       <w:r>
         <w:t xml:space="preserve"> </w:t>
       </w:r>
-      <w:hyperlink r:id="rId77">
+      <w:hyperlink r:id="rId84">
         <w:r>
           <w:rPr>
             <w:rStyle w:val="Hyperlink"/>
@@ -6764,8 +7574,8 @@
         <w:t xml:space="preserve">.</w:t>
       </w:r>
     </w:p>
-    <w:bookmarkEnd w:id="78"/>
-    <w:bookmarkStart w:id="80" w:name="ref-torresarias2019intoto"/>
+    <w:bookmarkEnd w:id="85"/>
+    <w:bookmarkStart w:id="87" w:name="ref-torresarias2019intoto"/>
     <w:p>
       <w:pPr>
         <w:pStyle w:val="Bibliography"/>
@@ -6795,7 +7605,7 @@
       <w:r>
         <w:t xml:space="preserve"> </w:t>
       </w:r>
-      <w:hyperlink r:id="rId79">
+      <w:hyperlink r:id="rId86">
         <w:r>
           <w:rPr>
             <w:rStyle w:val="Hyperlink"/>
@@ -6807,9 +7617,9 @@
         <w:t xml:space="preserve">.</w:t>
       </w:r>
     </w:p>
-    <w:bookmarkEnd w:id="80"/>
-    <w:bookmarkEnd w:id="81"/>
-    <w:bookmarkEnd w:id="82"/>
+    <w:bookmarkEnd w:id="87"/>
+    <w:bookmarkEnd w:id="88"/>
+    <w:bookmarkEnd w:id="89"/>
     <w:sectPr>
       <w:footnotePr>
         <w:numRestart w:val="eachSect"/>

</xml_diff>

<commit_message>
docs(paper): align v2 draft metadata with Core 4.1 and 319 tests
Fix abstract, title, intro contributions, limitations, reproducibility, and conclusion to match main@a5a7187; refresh Zenodo metadata and rebuild PDF/DOCX.

Co-authored-by: Cursor <cursoragent@cursor.com>
</commit_message>
<xml_diff>
--- a/paper/main.docx
+++ b/paper/main.docx
@@ -11,7 +11,17 @@
           <w:b/>
           <w:bCs/>
         </w:rPr>
-        <w:t xml:space="preserve">PhiGraph Core 4.0: A Shadow-First Evidence Ledger and Policy-Gated Runtime for Software-Agent Operations</w:t>
+        <w:t xml:space="preserve">PhiGraph Core 4.1: A Shadow-First Evidence Ledger,</w:t>
+      </w:r>
+      <w:r>
+        <w:br/>
+      </w:r>
+      <w:r>
+        <w:rPr>
+          <w:b/>
+          <w:bCs/>
+        </w:rPr>
+        <w:t xml:space="preserve">Transactional Scoped Storage, and GRDI for Software-Agent Operations</w:t>
       </w:r>
     </w:p>
     <w:p>
@@ -72,7 +82,7 @@
         <w:t xml:space="preserve"> </w:t>
       </w:r>
       <w:r>
-        <w:t xml:space="preserve">govern them. This paper presents PhiGraph Core 4.0.0, an MIT-licensed,</w:t>
+        <w:t xml:space="preserve">govern them. This paper presents PhiGraph Core 4.1.0-rc.6, an MIT-licensed,</w:t>
       </w:r>
       <w:r>
         <w:t xml:space="preserve"> </w:t>
@@ -102,127 +112,151 @@
         <w:t xml:space="preserve"> </w:t>
       </w:r>
       <w:r>
-        <w:t xml:space="preserve">proposals and operational execution. Replay and shadow modes cannot execute</w:t>
-      </w:r>
-      <w:r>
-        <w:t xml:space="preserve"> </w:t>
-      </w:r>
-      <w:r>
-        <w:t xml:space="preserve">external actions, while higher-authority modes require both an explicit</w:t>
-      </w:r>
-      <w:r>
-        <w:t xml:space="preserve"> </w:t>
-      </w:r>
-      <w:r>
-        <w:t xml:space="preserve">executor and an allowing policy decision. We describe the protocol, runtime,</w:t>
-      </w:r>
-      <w:r>
-        <w:t xml:space="preserve"> </w:t>
-      </w:r>
-      <w:r>
-        <w:t xml:space="preserve">ledger, deployment boundaries, and Python implementation. Core 4.1 adds a</w:t>
-      </w:r>
-      <w:r>
-        <w:t xml:space="preserve"> </w:t>
-      </w:r>
-      <w:r>
-        <w:t xml:space="preserve">scoped transactional ledger with declared write locks and fail-closed chain</w:t>
-      </w:r>
-      <w:r>
-        <w:t xml:space="preserve"> </w:t>
-      </w:r>
-      <w:r>
-        <w:t xml:space="preserve">verification for JSON and SQLite backends. Building on this substrate, we</w:t>
-      </w:r>
-      <w:r>
-        <w:t xml:space="preserve"> </w:t>
-      </w:r>
-      <w:r>
-        <w:t xml:space="preserve">additionally describe PhiGraph HAV v0.2, a fail-closed</w:t>
-      </w:r>
-      <w:r>
-        <w:t xml:space="preserve"> </w:t>
-      </w:r>
-      <w:r>
-        <w:t xml:space="preserve">verification layer that extracts claims from agent-generated text, checks them</w:t>
-      </w:r>
-      <w:r>
-        <w:t xml:space="preserve"> </w:t>
-      </w:r>
-      <w:r>
-        <w:t xml:space="preserve">against an explicitly supplied authoritative state, and records the resulting</w:t>
-      </w:r>
-      <w:r>
-        <w:t xml:space="preserve"> </w:t>
-      </w:r>
-      <w:r>
-        <w:t xml:space="preserve">claims, evidence, verifications, and policy decisions in the same ledger.</w:t>
-      </w:r>
-      <w:r>
-        <w:t xml:space="preserve"> </w:t>
-      </w:r>
-      <w:r>
-        <w:t xml:space="preserve">Engineering verification comprises 128 automated tests (117 core tests and 11</w:t>
-      </w:r>
-      <w:r>
-        <w:t xml:space="preserve"> </w:t>
-      </w:r>
-      <w:r>
-        <w:t xml:space="preserve">HAV-specific tests); the continuous-integration configuration targets Python</w:t>
-      </w:r>
-      <w:r>
-        <w:t xml:space="preserve"> </w:t>
-      </w:r>
-      <w:r>
-        <w:t xml:space="preserve">3.10–3.13. An initial external experiment on the CIC-IDS2017</w:t>
-      </w:r>
-      <w:r>
-        <w:t xml:space="preserve"> </w:t>
-      </w:r>
-      <w:r>
-        <w:t xml:space="preserve">Friday DDoS flow file compares a PhiGraph relational score with three</w:t>
-      </w:r>
-      <w:r>
-        <w:t xml:space="preserve"> </w:t>
-      </w:r>
-      <w:r>
-        <w:t xml:space="preserve">unsupervised baselines. Local Outlier Factor is strongest on this tabular</w:t>
-      </w:r>
-      <w:r>
-        <w:t xml:space="preserve"> </w:t>
-      </w:r>
-      <w:r>
-        <w:t xml:space="preserve">benchmark; PhiGraph ranks second by PR-AUC and attains 0.840 precision at a</w:t>
-      </w:r>
-      <w:r>
-        <w:t xml:space="preserve"> </w:t>
-      </w:r>
-      <w:r>
-        <w:t xml:space="preserve">10% alert budget. The experiment demonstrates functional integration, not</w:t>
-      </w:r>
-      <w:r>
-        <w:t xml:space="preserve"> </w:t>
-      </w:r>
-      <w:r>
-        <w:t xml:space="preserve">state-of-the-art superiority: it uses a single imperfect dataset, a</w:t>
-      </w:r>
-      <w:r>
-        <w:t xml:space="preserve"> </w:t>
-      </w:r>
-      <w:r>
-        <w:t xml:space="preserve">feature-similarity graph, and one fixed split. PhiGraph is therefore presented</w:t>
-      </w:r>
-      <w:r>
-        <w:t xml:space="preserve"> </w:t>
-      </w:r>
-      <w:r>
-        <w:t xml:space="preserve">as an auditable governance substrate and research prototype, not as a proof of</w:t>
-      </w:r>
-      <w:r>
-        <w:t xml:space="preserve"> </w:t>
-      </w:r>
-      <w:r>
-        <w:t xml:space="preserve">correctness, causal identification, or safe autonomous operation.</w:t>
+        <w:t xml:space="preserve">proposals and operational execution. Core 4.1 adds a scoped transactional</w:t>
+      </w:r>
+      <w:r>
+        <w:t xml:space="preserve"> </w:t>
+      </w:r>
+      <w:r>
+        <w:t xml:space="preserve">ledger with declared write locks, append-only GRDI hash chains, mutable Core</w:t>
+      </w:r>
+      <w:r>
+        <w:t xml:space="preserve"> </w:t>
+      </w:r>
+      <w:r>
+        <w:t xml:space="preserve">compare-and-set collections, and fail-closed</w:t>
+      </w:r>
+      <w:r>
+        <w:t xml:space="preserve"> </w:t>
+      </w:r>
+      <w:r>
+        <w:rPr>
+          <w:rStyle w:val="VerbatimChar"/>
+        </w:rPr>
+        <w:t xml:space="preserve">verify_scoped_chain</w:t>
+      </w:r>
+      <w:r>
+        <w:t xml:space="preserve"> </w:t>
+      </w:r>
+      <w:r>
+        <w:t xml:space="preserve">for JSON and SQLite backends. Governed Relational Decision Intelligence</w:t>
+      </w:r>
+      <w:r>
+        <w:t xml:space="preserve"> </w:t>
+      </w:r>
+      <w:r>
+        <w:t xml:space="preserve">(GRDI) 0.4.0 extends the stack with a persisted shadow decision chain—from</w:t>
+      </w:r>
+      <w:r>
+        <w:t xml:space="preserve"> </w:t>
+      </w:r>
+      <w:r>
+        <w:t xml:space="preserve">decision envelopes and authority through simulated gateway receipts, outcomes,</w:t>
+      </w:r>
+      <w:r>
+        <w:t xml:space="preserve"> </w:t>
+      </w:r>
+      <w:r>
+        <w:t xml:space="preserve">and deterministic replay audit—without external execution in the current</w:t>
+      </w:r>
+      <w:r>
+        <w:t xml:space="preserve"> </w:t>
+      </w:r>
+      <w:r>
+        <w:t xml:space="preserve">release. We additionally describe PhiGraph HAV v0.2, a fail-closed verification</w:t>
+      </w:r>
+      <w:r>
+        <w:t xml:space="preserve"> </w:t>
+      </w:r>
+      <w:r>
+        <w:t xml:space="preserve">layer that checks agent-generated text against an explicitly supplied</w:t>
+      </w:r>
+      <w:r>
+        <w:t xml:space="preserve"> </w:t>
+      </w:r>
+      <w:r>
+        <w:t xml:space="preserve">authoritative state. Replay and shadow modes cannot execute external actions,</w:t>
+      </w:r>
+      <w:r>
+        <w:t xml:space="preserve"> </w:t>
+      </w:r>
+      <w:r>
+        <w:t xml:space="preserve">while higher-authority modes require both an explicit executor and an allowing</w:t>
+      </w:r>
+      <w:r>
+        <w:t xml:space="preserve"> </w:t>
+      </w:r>
+      <w:r>
+        <w:t xml:space="preserve">policy decision. Engineering verification comprises 319 automated tests on</w:t>
+      </w:r>
+      <w:r>
+        <w:t xml:space="preserve"> </w:t>
+      </w:r>
+      <w:r>
+        <w:rPr>
+          <w:rStyle w:val="VerbatimChar"/>
+        </w:rPr>
+        <w:t xml:space="preserve">main@a5a7187</w:t>
+      </w:r>
+      <w:r>
+        <w:t xml:space="preserve"> </w:t>
+      </w:r>
+      <w:r>
+        <w:t xml:space="preserve">(262 baseline, 57 scoped transactional contract, and 11</w:t>
+      </w:r>
+      <w:r>
+        <w:t xml:space="preserve"> </w:t>
+      </w:r>
+      <w:r>
+        <w:t xml:space="preserve">HAV-specific tests); continuous integration targets Python 3.10–3.13. An</w:t>
+      </w:r>
+      <w:r>
+        <w:t xml:space="preserve"> </w:t>
+      </w:r>
+      <w:r>
+        <w:t xml:space="preserve">initial external experiment on the CIC-IDS2017 Friday DDoS flow file compares a</w:t>
+      </w:r>
+      <w:r>
+        <w:t xml:space="preserve"> </w:t>
+      </w:r>
+      <w:r>
+        <w:t xml:space="preserve">PhiGraph relational score with three unsupervised baselines. Local Outlier</w:t>
+      </w:r>
+      <w:r>
+        <w:t xml:space="preserve"> </w:t>
+      </w:r>
+      <w:r>
+        <w:t xml:space="preserve">Factor is strongest on this tabular benchmark; PhiGraph ranks second by PR-AUC</w:t>
+      </w:r>
+      <w:r>
+        <w:t xml:space="preserve"> </w:t>
+      </w:r>
+      <w:r>
+        <w:t xml:space="preserve">and attains 0.840 precision at a 10% alert budget. The experiment</w:t>
+      </w:r>
+      <w:r>
+        <w:t xml:space="preserve"> </w:t>
+      </w:r>
+      <w:r>
+        <w:t xml:space="preserve">demonstrates functional integration, not state-of-the-art superiority. PhiGraph</w:t>
+      </w:r>
+      <w:r>
+        <w:t xml:space="preserve"> </w:t>
+      </w:r>
+      <w:r>
+        <w:t xml:space="preserve">is therefore presented as an auditable governance substrate and research</w:t>
+      </w:r>
+      <w:r>
+        <w:t xml:space="preserve"> </w:t>
+      </w:r>
+      <w:r>
+        <w:t xml:space="preserve">prototype (development candidate), not as a proof of correctness, causal</w:t>
+      </w:r>
+      <w:r>
+        <w:t xml:space="preserve"> </w:t>
+      </w:r>
+      <w:r>
+        <w:t xml:space="preserve">identification, or safe autonomous operation.</w:t>
       </w:r>
     </w:p>
     <w:p>
@@ -246,13 +280,13 @@
         <w:t xml:space="preserve"> </w:t>
       </w:r>
       <w:r>
-        <w:t xml:space="preserve">evidence ledger; graph intelligence; policy enforcement; shadow deployment;</w:t>
-      </w:r>
-      <w:r>
-        <w:t xml:space="preserve"> </w:t>
-      </w:r>
-      <w:r>
-        <w:t xml:space="preserve">claim verification; reproducible software</w:t>
+        <w:t xml:space="preserve">evidence ledger; transactional ledger; GRDI; replay audit; graph intelligence;</w:t>
+      </w:r>
+      <w:r>
+        <w:t xml:space="preserve"> </w:t>
+      </w:r>
+      <w:r>
+        <w:t xml:space="preserve">policy enforcement; shadow deployment; claim verification; reproducible software</w:t>
       </w:r>
     </w:p>
     <w:bookmarkStart w:id="10" w:name="introduction"/>
@@ -422,7 +456,7 @@
         <w:pStyle w:val="BodyText"/>
       </w:pPr>
       <w:r>
-        <w:t xml:space="preserve">This paper makes five contributions:</w:t>
+        <w:t xml:space="preserve">This paper makes seven contributions:</w:t>
       </w:r>
     </w:p>
     <w:p>
@@ -484,7 +518,53 @@
         </w:numPr>
       </w:pPr>
       <w:r>
-        <w:t xml:space="preserve">HAV v0.2, a fail-closed extension that verifies agent-generated</w:t>
+        <w:t xml:space="preserve">a scoped transactional store (Core 4.1) with declared write locks,</w:t>
+      </w:r>
+      <w:r>
+        <w:t xml:space="preserve"> </w:t>
+      </w:r>
+      <w:r>
+        <w:t xml:space="preserve">idempotent append-once semantics, and fail-closed chain verification</w:t>
+      </w:r>
+      <w:r>
+        <w:t xml:space="preserve"> </w:t>
+      </w:r>
+      <w:r>
+        <w:t xml:space="preserve">on JSON and SQLite backends;</w:t>
+      </w:r>
+    </w:p>
+    <w:p>
+      <w:pPr>
+        <w:numPr>
+          <w:ilvl w:val="0"/>
+          <w:numId w:val="1001"/>
+        </w:numPr>
+      </w:pPr>
+      <w:r>
+        <w:t xml:space="preserve">GRDI 0.4.0, a persisted shadow decision chain from HAV-linked envelopes</w:t>
+      </w:r>
+      <w:r>
+        <w:t xml:space="preserve"> </w:t>
+      </w:r>
+      <w:r>
+        <w:t xml:space="preserve">through authority, simulated gateway receipts, outcomes, and replay</w:t>
+      </w:r>
+      <w:r>
+        <w:t xml:space="preserve"> </w:t>
+      </w:r>
+      <w:r>
+        <w:t xml:space="preserve">audit, without external execution in the current release;</w:t>
+      </w:r>
+    </w:p>
+    <w:p>
+      <w:pPr>
+        <w:numPr>
+          <w:ilvl w:val="0"/>
+          <w:numId w:val="1001"/>
+        </w:numPr>
+      </w:pPr>
+      <w:r>
+        <w:t xml:space="preserve">HAV v0.2, a fail-closed extension that verifies agent-generated</w:t>
       </w:r>
       <w:r>
         <w:t xml:space="preserve"> </w:t>
@@ -6183,7 +6263,7 @@
     </w:p>
     <w:bookmarkEnd w:id="49"/>
     <w:bookmarkEnd w:id="50"/>
-    <w:bookmarkStart w:id="56" w:name="threats-to-validity-and-limitations"/>
+    <w:bookmarkStart w:id="58" w:name="threats-to-validity-and-limitations"/>
     <w:p>
       <w:pPr>
         <w:pStyle w:val="Heading1"/>
@@ -6363,7 +6443,136 @@
       </w:r>
     </w:p>
     <w:bookmarkEnd w:id="53"/>
-    <w:bookmarkStart w:id="54" w:name="hav-validity."/>
+    <w:bookmarkStart w:id="54" w:name="transactional-ledger-validity."/>
+    <w:p>
+      <w:pPr>
+        <w:pStyle w:val="Heading4"/>
+      </w:pPr>
+      <w:r>
+        <w:t xml:space="preserve">Transactional ledger validity.</w:t>
+      </w:r>
+    </w:p>
+    <w:p>
+      <w:pPr>
+        <w:pStyle w:val="FirstParagraph"/>
+      </w:pPr>
+      <w:r>
+        <w:t xml:space="preserve">The scoped transactional API is implemented for JSON (single-process staging)</w:t>
+      </w:r>
+      <w:r>
+        <w:t xml:space="preserve"> </w:t>
+      </w:r>
+      <w:r>
+        <w:t xml:space="preserve">and SQLite (</w:t>
+      </w:r>
+      <w:r>
+        <w:rPr>
+          <w:rStyle w:val="VerbatimChar"/>
+        </w:rPr>
+        <w:t xml:space="preserve">BEGIN IMMEDIATE</w:t>
+      </w:r>
+      <w:r>
+        <w:t xml:space="preserve">). JSON rejects</w:t>
+      </w:r>
+      <w:r>
+        <w:t xml:space="preserve"> </w:t>
+      </w:r>
+      <w:r>
+        <w:rPr>
+          <w:rStyle w:val="VerbatimChar"/>
+        </w:rPr>
+        <w:t xml:space="preserve">transactional_mode=multiprocess</w:t>
+      </w:r>
+      <w:r>
+        <w:t xml:space="preserve"> </w:t>
+      </w:r>
+      <w:r>
+        <w:t xml:space="preserve">fail-closed. A PostgreSQL backend</w:t>
+      </w:r>
+      <w:r>
+        <w:t xml:space="preserve"> </w:t>
+      </w:r>
+      <w:r>
+        <w:t xml:space="preserve">with the same semantics is specified but not shipped in Core 4.1.0-rc.6.</w:t>
+      </w:r>
+      <w:r>
+        <w:t xml:space="preserve"> </w:t>
+      </w:r>
+      <w:r>
+        <w:t xml:space="preserve">Contract tests establish integrity checks for the released backends; they do</w:t>
+      </w:r>
+      <w:r>
+        <w:t xml:space="preserve"> </w:t>
+      </w:r>
+      <w:r>
+        <w:t xml:space="preserve">not prove Byzantine fault tolerance or safety under a compromised signing key</w:t>
+      </w:r>
+      <w:r>
+        <w:t xml:space="preserve"> </w:t>
+      </w:r>
+      <w:r>
+        <w:t xml:space="preserve">and unrestricted storage access.</w:t>
+      </w:r>
+    </w:p>
+    <w:bookmarkEnd w:id="54"/>
+    <w:bookmarkStart w:id="55" w:name="grdi-and-replay-validity."/>
+    <w:p>
+      <w:pPr>
+        <w:pStyle w:val="Heading4"/>
+      </w:pPr>
+      <w:r>
+        <w:t xml:space="preserve">GRDI and replay validity.</w:t>
+      </w:r>
+    </w:p>
+    <w:p>
+      <w:pPr>
+        <w:pStyle w:val="FirstParagraph"/>
+      </w:pPr>
+      <w:r>
+        <w:t xml:space="preserve">GRDI records a shadow decision chain with explicit</w:t>
+      </w:r>
+      <w:r>
+        <w:t xml:space="preserve"> </w:t>
+      </w:r>
+      <w:r>
+        <w:rPr>
+          <w:rStyle w:val="VerbatimChar"/>
+        </w:rPr>
+        <w:t xml:space="preserve">NOT_EXECUTED</w:t>
+      </w:r>
+      <w:r>
+        <w:t xml:space="preserve"> </w:t>
+      </w:r>
+      <w:r>
+        <w:t xml:space="preserve">invariants. Replay audit verifies persisted structure and signatures without</w:t>
+      </w:r>
+      <w:r>
+        <w:t xml:space="preserve"> </w:t>
+      </w:r>
+      <w:r>
+        <w:t xml:space="preserve">re-running simulation or authority evaluation. Historical comparison reports</w:t>
+      </w:r>
+      <w:r>
+        <w:t xml:space="preserve"> </w:t>
+      </w:r>
+      <w:r>
+        <w:t xml:space="preserve">structural differences only; it does not establish causal improvement,</w:t>
+      </w:r>
+      <w:r>
+        <w:t xml:space="preserve"> </w:t>
+      </w:r>
+      <w:r>
+        <w:t xml:space="preserve">semantic equivalence across deployments, or correctness of shadow simulations.</w:t>
+      </w:r>
+      <w:r>
+        <w:t xml:space="preserve"> </w:t>
+      </w:r>
+      <w:r>
+        <w:t xml:space="preserve">External connectors and live execution remain out of scope.</w:t>
+      </w:r>
+    </w:p>
+    <w:bookmarkEnd w:id="55"/>
+    <w:bookmarkStart w:id="56" w:name="hav-validity."/>
     <w:p>
       <w:pPr>
         <w:pStyle w:val="Heading4"/>
@@ -6454,8 +6663,8 @@
         <w:t xml:space="preserve">documented as an auxiliary signal rather than proof of factual agreement.</w:t>
       </w:r>
     </w:p>
-    <w:bookmarkEnd w:id="54"/>
-    <w:bookmarkStart w:id="55" w:name="causal-and-governance-claims."/>
+    <w:bookmarkEnd w:id="56"/>
+    <w:bookmarkStart w:id="57" w:name="causal-and-governance-claims."/>
     <w:p>
       <w:pPr>
         <w:pStyle w:val="Heading4"/>
@@ -6502,9 +6711,9 @@
         <w:t xml:space="preserve">legal, or correct outcomes.</w:t>
       </w:r>
     </w:p>
-    <w:bookmarkEnd w:id="55"/>
-    <w:bookmarkEnd w:id="56"/>
-    <w:bookmarkStart w:id="59" w:name="reproducibility-and-availability"/>
+    <w:bookmarkEnd w:id="57"/>
+    <w:bookmarkEnd w:id="58"/>
+    <w:bookmarkStart w:id="61" w:name="reproducibility-and-availability"/>
     <w:p>
       <w:pPr>
         <w:pStyle w:val="Heading1"/>
@@ -6518,7 +6727,7 @@
         <w:pStyle w:val="FirstParagraph"/>
       </w:pPr>
       <w:r>
-        <w:t xml:space="preserve">PhiGraph Core 4.0.0 is implemented in Python and distributed under the MIT</w:t>
+        <w:t xml:space="preserve">PhiGraph Core 4.1.0-rc.6 is implemented in Python and distributed under the MIT</w:t>
       </w:r>
       <w:r>
         <w:t xml:space="preserve"> </w:t>
@@ -6529,7 +6738,7 @@
       <w:r>
         <w:t xml:space="preserve"> </w:t>
       </w:r>
-      <w:hyperlink r:id="rId57">
+      <w:hyperlink r:id="rId59">
         <w:r>
           <w:rPr>
             <w:rStyle w:val="Hyperlink"/>
@@ -6538,12 +6747,51 @@
         </w:r>
       </w:hyperlink>
       <w:r>
-        <w:t xml:space="preserve">. This paper is archived on Zenodo at</w:t>
-      </w:r>
-      <w:r>
-        <w:t xml:space="preserve"> </w:t>
-      </w:r>
-      <w:hyperlink r:id="rId58">
+        <w:t xml:space="preserve">. The v2 draft described here</w:t>
+      </w:r>
+      <w:r>
+        <w:t xml:space="preserve"> </w:t>
+      </w:r>
+      <w:r>
+        <w:t xml:space="preserve">corresponds to Git commit</w:t>
+      </w:r>
+      <w:r>
+        <w:t xml:space="preserve"> </w:t>
+      </w:r>
+      <w:r>
+        <w:rPr>
+          <w:rStyle w:val="VerbatimChar"/>
+        </w:rPr>
+        <w:t xml:space="preserve">a5a7187</w:t>
+      </w:r>
+      <w:r>
+        <w:t xml:space="preserve"> </w:t>
+      </w:r>
+      <w:r>
+        <w:t xml:space="preserve">on</w:t>
+      </w:r>
+      <w:r>
+        <w:t xml:space="preserve"> </w:t>
+      </w:r>
+      <w:r>
+        <w:rPr>
+          <w:rStyle w:val="VerbatimChar"/>
+        </w:rPr>
+        <w:t xml:space="preserve">main</w:t>
+      </w:r>
+      <w:r>
+        <w:t xml:space="preserve">. This paper is</w:t>
+      </w:r>
+      <w:r>
+        <w:t xml:space="preserve"> </w:t>
+      </w:r>
+      <w:r>
+        <w:t xml:space="preserve">archived on Zenodo at</w:t>
+      </w:r>
+      <w:r>
+        <w:t xml:space="preserve"> </w:t>
+      </w:r>
+      <w:hyperlink r:id="rId60">
         <w:r>
           <w:rPr>
             <w:rStyle w:val="Hyperlink"/>
@@ -6552,13 +6800,22 @@
         </w:r>
       </w:hyperlink>
       <w:r>
-        <w:t xml:space="preserve">. The paper source and references are</w:t>
-      </w:r>
-      <w:r>
-        <w:t xml:space="preserve"> </w:t>
-      </w:r>
-      <w:r>
-        <w:t xml:space="preserve">licensed under CC BY 4.0.</w:t>
+        <w:t xml:space="preserve"> </w:t>
+      </w:r>
+      <w:r>
+        <w:t xml:space="preserve">(v1); a new version upload will</w:t>
+      </w:r>
+      <w:r>
+        <w:t xml:space="preserve"> </w:t>
+      </w:r>
+      <w:r>
+        <w:t xml:space="preserve">supersede the PDF while retaining the same DOI. The paper source and references</w:t>
+      </w:r>
+      <w:r>
+        <w:t xml:space="preserve"> </w:t>
+      </w:r>
+      <w:r>
+        <w:t xml:space="preserve">are licensed under CC BY 4.0.</w:t>
       </w:r>
     </w:p>
     <w:p>
@@ -6603,6 +6860,25 @@
         <w:pStyle w:val="FirstParagraph"/>
       </w:pPr>
       <w:r>
+        <w:t xml:space="preserve">Scoped transactional contract tests:</w:t>
+      </w:r>
+    </w:p>
+    <w:p>
+      <w:pPr>
+        <w:pStyle w:val="SourceCode"/>
+      </w:pPr>
+      <w:r>
+        <w:rPr>
+          <w:rStyle w:val="VerbatimChar"/>
+        </w:rPr>
+        <w:t xml:space="preserve">pytest tests/contract/test_transactional_*.py</w:t>
+      </w:r>
+    </w:p>
+    <w:p>
+      <w:pPr>
+        <w:pStyle w:val="FirstParagraph"/>
+      </w:pPr>
+      <w:r>
         <w:t xml:space="preserve">The HAV-specific tests can be run in isolation with:</w:t>
       </w:r>
     </w:p>
@@ -6718,7 +6994,7 @@
       <w:r>
         <w:t xml:space="preserve"> </w:t>
       </w:r>
-      <w:hyperlink r:id="rId58">
+      <w:hyperlink r:id="rId60">
         <w:r>
           <w:rPr>
             <w:rStyle w:val="Hyperlink"/>
@@ -6730,8 +7006,8 @@
         <w:t xml:space="preserve">.</w:t>
       </w:r>
     </w:p>
-    <w:bookmarkEnd w:id="59"/>
-    <w:bookmarkStart w:id="60" w:name="ethical-and-operational-considerations"/>
+    <w:bookmarkEnd w:id="61"/>
+    <w:bookmarkStart w:id="62" w:name="ethical-and-operational-considerations"/>
     <w:p>
       <w:pPr>
         <w:pStyle w:val="Heading1"/>
@@ -6796,8 +7072,8 @@
         <w:t xml:space="preserve">finance, health, or critical infrastructure.</w:t>
       </w:r>
     </w:p>
-    <w:bookmarkEnd w:id="60"/>
-    <w:bookmarkStart w:id="61" w:name="conclusion"/>
+    <w:bookmarkEnd w:id="62"/>
+    <w:bookmarkStart w:id="63" w:name="conclusion"/>
     <w:p>
       <w:pPr>
         <w:pStyle w:val="Heading1"/>
@@ -6829,19 +7105,25 @@
         <w:t xml:space="preserve"> </w:t>
       </w:r>
       <w:r>
-        <w:t xml:space="preserve">remain auditable. Version 4.0.0 demonstrates this design through a typed</w:t>
-      </w:r>
-      <w:r>
-        <w:t xml:space="preserve"> </w:t>
-      </w:r>
-      <w:r>
-        <w:t xml:space="preserve">protocol, tamper-evident ledger, policy-gated runtime, scope-tagged records, and</w:t>
-      </w:r>
-      <w:r>
-        <w:t xml:space="preserve"> </w:t>
-      </w:r>
-      <w:r>
-        <w:t xml:space="preserve">an automated test suite. HAV v0.2 extends the same design to a concrete</w:t>
+        <w:t xml:space="preserve">remain auditable. Core 4.1.0-rc.6 demonstrates this design through a typed</w:t>
+      </w:r>
+      <w:r>
+        <w:t xml:space="preserve"> </w:t>
+      </w:r>
+      <w:r>
+        <w:t xml:space="preserve">protocol, tamper-evident ledger, scoped transactional store, GRDI shadow</w:t>
+      </w:r>
+      <w:r>
+        <w:t xml:space="preserve"> </w:t>
+      </w:r>
+      <w:r>
+        <w:t xml:space="preserve">decision chain, policy-gated runtime, scope-tagged records, and an automated</w:t>
+      </w:r>
+      <w:r>
+        <w:t xml:space="preserve"> </w:t>
+      </w:r>
+      <w:r>
+        <w:t xml:space="preserve">test suite of 319 cases. HAV v0.2 extends the same design to a concrete</w:t>
       </w:r>
       <w:r>
         <w:t xml:space="preserve"> </w:t>
@@ -6910,8 +7192,8 @@
         <w:t xml:space="preserve">anchored audit storage, and prospective shadow deployments.</w:t>
       </w:r>
     </w:p>
-    <w:bookmarkEnd w:id="61"/>
-    <w:bookmarkStart w:id="62" w:name="author-contributions"/>
+    <w:bookmarkEnd w:id="63"/>
+    <w:bookmarkStart w:id="64" w:name="author-contributions"/>
     <w:p>
       <w:pPr>
         <w:pStyle w:val="Heading1"/>
@@ -6940,8 +7222,8 @@
         <w:t xml:space="preserve">manuscript.</w:t>
       </w:r>
     </w:p>
-    <w:bookmarkEnd w:id="62"/>
-    <w:bookmarkStart w:id="63" w:name="conflict-of-interest"/>
+    <w:bookmarkEnd w:id="64"/>
+    <w:bookmarkStart w:id="65" w:name="conflict-of-interest"/>
     <w:p>
       <w:pPr>
         <w:pStyle w:val="Heading1"/>
@@ -6970,8 +7252,8 @@
         <w:t xml:space="preserve">The evaluation and limitations are reported to enable independent scrutiny.</w:t>
       </w:r>
     </w:p>
-    <w:bookmarkEnd w:id="63"/>
-    <w:bookmarkStart w:id="89" w:name="license"/>
+    <w:bookmarkEnd w:id="65"/>
+    <w:bookmarkStart w:id="91" w:name="license"/>
     <w:p>
       <w:pPr>
         <w:pStyle w:val="Heading1"/>
@@ -6994,8 +7276,8 @@
         <w:t xml:space="preserve">International License (CC BY 4.0).</w:t>
       </w:r>
     </w:p>
-    <w:bookmarkStart w:id="88" w:name="refs"/>
-    <w:bookmarkStart w:id="65" w:name="ref-battaglia2018relational"/>
+    <w:bookmarkStart w:id="90" w:name="refs"/>
+    <w:bookmarkStart w:id="67" w:name="ref-battaglia2018relational"/>
     <w:p>
       <w:pPr>
         <w:pStyle w:val="Bibliography"/>
@@ -7028,7 +7310,7 @@
       <w:r>
         <w:t xml:space="preserve"> </w:t>
       </w:r>
-      <w:hyperlink r:id="rId64">
+      <w:hyperlink r:id="rId66">
         <w:r>
           <w:rPr>
             <w:rStyle w:val="Hyperlink"/>
@@ -7040,8 +7322,8 @@
         <w:t xml:space="preserve">.</w:t>
       </w:r>
     </w:p>
-    <w:bookmarkEnd w:id="65"/>
-    <w:bookmarkStart w:id="67" w:name="ref-gebru2021datasheets"/>
+    <w:bookmarkEnd w:id="67"/>
+    <w:bookmarkStart w:id="69" w:name="ref-gebru2021datasheets"/>
     <w:p>
       <w:pPr>
         <w:pStyle w:val="Bibliography"/>
@@ -7074,7 +7356,7 @@
       <w:r>
         <w:t xml:space="preserve"> </w:t>
       </w:r>
-      <w:hyperlink r:id="rId66">
+      <w:hyperlink r:id="rId68">
         <w:r>
           <w:rPr>
             <w:rStyle w:val="Hyperlink"/>
@@ -7086,8 +7368,8 @@
         <w:t xml:space="preserve">.</w:t>
       </w:r>
     </w:p>
-    <w:bookmarkEnd w:id="67"/>
-    <w:bookmarkStart w:id="69" w:name="ref-ji2023hallucination"/>
+    <w:bookmarkEnd w:id="69"/>
+    <w:bookmarkStart w:id="71" w:name="ref-ji2023hallucination"/>
     <w:p>
       <w:pPr>
         <w:pStyle w:val="Bibliography"/>
@@ -7120,7 +7402,7 @@
       <w:r>
         <w:t xml:space="preserve"> </w:t>
       </w:r>
-      <w:hyperlink r:id="rId68">
+      <w:hyperlink r:id="rId70">
         <w:r>
           <w:rPr>
             <w:rStyle w:val="Hyperlink"/>
@@ -7132,8 +7414,8 @@
         <w:t xml:space="preserve">.</w:t>
       </w:r>
     </w:p>
-    <w:bookmarkEnd w:id="69"/>
-    <w:bookmarkStart w:id="71" w:name="ref-lanvin2022errors"/>
+    <w:bookmarkEnd w:id="71"/>
+    <w:bookmarkStart w:id="73" w:name="ref-lanvin2022errors"/>
     <w:p>
       <w:pPr>
         <w:pStyle w:val="Bibliography"/>
@@ -7175,7 +7457,7 @@
       <w:r>
         <w:t xml:space="preserve"> </w:t>
       </w:r>
-      <w:hyperlink r:id="rId70">
+      <w:hyperlink r:id="rId72">
         <w:r>
           <w:rPr>
             <w:rStyle w:val="Hyperlink"/>
@@ -7187,8 +7469,8 @@
         <w:t xml:space="preserve">.</w:t>
       </w:r>
     </w:p>
-    <w:bookmarkEnd w:id="71"/>
-    <w:bookmarkStart w:id="73" w:name="ref-lebo2013provo"/>
+    <w:bookmarkEnd w:id="73"/>
+    <w:bookmarkStart w:id="75" w:name="ref-lebo2013provo"/>
     <w:p>
       <w:pPr>
         <w:pStyle w:val="Bibliography"/>
@@ -7247,7 +7529,7 @@
       <w:r>
         <w:t xml:space="preserve"> </w:t>
       </w:r>
-      <w:hyperlink r:id="rId72">
+      <w:hyperlink r:id="rId74">
         <w:r>
           <w:rPr>
             <w:rStyle w:val="Hyperlink"/>
@@ -7259,8 +7541,8 @@
         <w:t xml:space="preserve">.</w:t>
       </w:r>
     </w:p>
-    <w:bookmarkEnd w:id="73"/>
-    <w:bookmarkStart w:id="75" w:name="ref-liu2022errors"/>
+    <w:bookmarkEnd w:id="75"/>
+    <w:bookmarkStart w:id="77" w:name="ref-liu2022errors"/>
     <w:p>
       <w:pPr>
         <w:pStyle w:val="Bibliography"/>
@@ -7323,7 +7605,7 @@
       <w:r>
         <w:t xml:space="preserve"> </w:t>
       </w:r>
-      <w:hyperlink r:id="rId74">
+      <w:hyperlink r:id="rId76">
         <w:r>
           <w:rPr>
             <w:rStyle w:val="Hyperlink"/>
@@ -7335,8 +7617,8 @@
         <w:t xml:space="preserve">.</w:t>
       </w:r>
     </w:p>
-    <w:bookmarkEnd w:id="75"/>
-    <w:bookmarkStart w:id="77" w:name="ref-mitchell2019modelcards"/>
+    <w:bookmarkEnd w:id="77"/>
+    <w:bookmarkStart w:id="79" w:name="ref-mitchell2019modelcards"/>
     <w:p>
       <w:pPr>
         <w:pStyle w:val="Bibliography"/>
@@ -7366,7 +7648,7 @@
       <w:r>
         <w:t xml:space="preserve"> </w:t>
       </w:r>
-      <w:hyperlink r:id="rId76">
+      <w:hyperlink r:id="rId78">
         <w:r>
           <w:rPr>
             <w:rStyle w:val="Hyperlink"/>
@@ -7378,8 +7660,8 @@
         <w:t xml:space="preserve">.</w:t>
       </w:r>
     </w:p>
-    <w:bookmarkEnd w:id="77"/>
-    <w:bookmarkStart w:id="79" w:name="ref-owasp2025agentic"/>
+    <w:bookmarkEnd w:id="79"/>
+    <w:bookmarkStart w:id="81" w:name="ref-owasp2025agentic"/>
     <w:p>
       <w:pPr>
         <w:pStyle w:val="Bibliography"/>
@@ -7403,7 +7685,7 @@
       <w:r>
         <w:t xml:space="preserve"> </w:t>
       </w:r>
-      <w:hyperlink r:id="rId78">
+      <w:hyperlink r:id="rId80">
         <w:r>
           <w:rPr>
             <w:rStyle w:val="Hyperlink"/>
@@ -7415,8 +7697,8 @@
         <w:t xml:space="preserve">.</w:t>
       </w:r>
     </w:p>
-    <w:bookmarkEnd w:id="79"/>
-    <w:bookmarkStart w:id="81" w:name="ref-sharafaldin2018cicids"/>
+    <w:bookmarkEnd w:id="81"/>
+    <w:bookmarkStart w:id="83" w:name="ref-sharafaldin2018cicids"/>
     <w:p>
       <w:pPr>
         <w:pStyle w:val="Bibliography"/>
@@ -7446,7 +7728,7 @@
       <w:r>
         <w:t xml:space="preserve"> </w:t>
       </w:r>
-      <w:hyperlink r:id="rId80">
+      <w:hyperlink r:id="rId82">
         <w:r>
           <w:rPr>
             <w:rStyle w:val="Hyperlink"/>
@@ -7458,8 +7740,8 @@
         <w:t xml:space="preserve">.</w:t>
       </w:r>
     </w:p>
-    <w:bookmarkEnd w:id="81"/>
-    <w:bookmarkStart w:id="83" w:name="ref-nist2023airmf"/>
+    <w:bookmarkEnd w:id="83"/>
+    <w:bookmarkStart w:id="85" w:name="ref-nist2023airmf"/>
     <w:p>
       <w:pPr>
         <w:pStyle w:val="Bibliography"/>
@@ -7504,7 +7786,7 @@
       <w:r>
         <w:t xml:space="preserve"> </w:t>
       </w:r>
-      <w:hyperlink r:id="rId82">
+      <w:hyperlink r:id="rId84">
         <w:r>
           <w:rPr>
             <w:rStyle w:val="Hyperlink"/>
@@ -7516,8 +7798,8 @@
         <w:t xml:space="preserve">.</w:t>
       </w:r>
     </w:p>
-    <w:bookmarkEnd w:id="83"/>
-    <w:bookmarkStart w:id="85" w:name="ref-thorne2018fever"/>
+    <w:bookmarkEnd w:id="85"/>
+    <w:bookmarkStart w:id="87" w:name="ref-thorne2018fever"/>
     <w:p>
       <w:pPr>
         <w:pStyle w:val="Bibliography"/>
@@ -7562,7 +7844,7 @@
       <w:r>
         <w:t xml:space="preserve"> </w:t>
       </w:r>
-      <w:hyperlink r:id="rId84">
+      <w:hyperlink r:id="rId86">
         <w:r>
           <w:rPr>
             <w:rStyle w:val="Hyperlink"/>
@@ -7574,8 +7856,8 @@
         <w:t xml:space="preserve">.</w:t>
       </w:r>
     </w:p>
-    <w:bookmarkEnd w:id="85"/>
-    <w:bookmarkStart w:id="87" w:name="ref-torresarias2019intoto"/>
+    <w:bookmarkEnd w:id="87"/>
+    <w:bookmarkStart w:id="89" w:name="ref-torresarias2019intoto"/>
     <w:p>
       <w:pPr>
         <w:pStyle w:val="Bibliography"/>
@@ -7605,7 +7887,7 @@
       <w:r>
         <w:t xml:space="preserve"> </w:t>
       </w:r>
-      <w:hyperlink r:id="rId86">
+      <w:hyperlink r:id="rId88">
         <w:r>
           <w:rPr>
             <w:rStyle w:val="Hyperlink"/>
@@ -7617,9 +7899,9 @@
         <w:t xml:space="preserve">.</w:t>
       </w:r>
     </w:p>
-    <w:bookmarkEnd w:id="87"/>
-    <w:bookmarkEnd w:id="88"/>
     <w:bookmarkEnd w:id="89"/>
+    <w:bookmarkEnd w:id="90"/>
+    <w:bookmarkEnd w:id="91"/>
     <w:sectPr>
       <w:footnotePr>
         <w:numRestart w:val="eachSect"/>

</xml_diff>

<commit_message>
docs(paper): update Fig. 1, reorder §4.5–4.7, add verify figure
Architecture diagram adds scoped store, HAV, and GRDI; subsections follow HAV → GRDI → API; new Fig. 9 for verify_scoped_chain fail-closed checks.

Co-authored-by: Cursor <cursoragent@cursor.com>
</commit_message>
<xml_diff>
--- a/paper/main.docx
+++ b/paper/main.docx
@@ -541,19 +541,19 @@
         </w:numPr>
       </w:pPr>
       <w:r>
-        <w:t xml:space="preserve">GRDI 0.4.0, a persisted shadow decision chain from HAV-linked envelopes</w:t>
-      </w:r>
-      <w:r>
-        <w:t xml:space="preserve"> </w:t>
-      </w:r>
-      <w:r>
-        <w:t xml:space="preserve">through authority, simulated gateway receipts, outcomes, and replay</w:t>
-      </w:r>
-      <w:r>
-        <w:t xml:space="preserve"> </w:t>
-      </w:r>
-      <w:r>
-        <w:t xml:space="preserve">audit, without external execution in the current release;</w:t>
+        <w:t xml:space="preserve">HAV v0.2, a fail-closed extension that verifies agent-generated</w:t>
+      </w:r>
+      <w:r>
+        <w:t xml:space="preserve"> </w:t>
+      </w:r>
+      <w:r>
+        <w:t xml:space="preserve">textual claims against an authoritative external state and records</w:t>
+      </w:r>
+      <w:r>
+        <w:t xml:space="preserve"> </w:t>
+      </w:r>
+      <w:r>
+        <w:t xml:space="preserve">the result through the same protocol and ledger;</w:t>
       </w:r>
     </w:p>
     <w:p>
@@ -564,19 +564,19 @@
         </w:numPr>
       </w:pPr>
       <w:r>
-        <w:t xml:space="preserve">HAV v0.2, a fail-closed extension that verifies agent-generated</w:t>
-      </w:r>
-      <w:r>
-        <w:t xml:space="preserve"> </w:t>
-      </w:r>
-      <w:r>
-        <w:t xml:space="preserve">textual claims against an authoritative external state and records</w:t>
-      </w:r>
-      <w:r>
-        <w:t xml:space="preserve"> </w:t>
-      </w:r>
-      <w:r>
-        <w:t xml:space="preserve">the result through the same protocol and ledger; and</w:t>
+        <w:t xml:space="preserve">GRDI 0.4.0, a persisted shadow decision chain from HAV-linked envelopes</w:t>
+      </w:r>
+      <w:r>
+        <w:t xml:space="preserve"> </w:t>
+      </w:r>
+      <w:r>
+        <w:t xml:space="preserve">through authority, simulated gateway receipts, outcomes, and replay</w:t>
+      </w:r>
+      <w:r>
+        <w:t xml:space="preserve"> </w:t>
+      </w:r>
+      <w:r>
+        <w:t xml:space="preserve">audit, without external execution in the current release; and</w:t>
       </w:r>
     </w:p>
     <w:p>
@@ -931,7 +931,7 @@
           <w:rPr>
             <w:rStyle w:val="Hyperlink"/>
           </w:rPr>
-          <w:t xml:space="preserve">4.6</w:t>
+          <w:t xml:space="preserve">4.5</w:t>
         </w:r>
       </w:hyperlink>
       <w:r>
@@ -1298,7 +1298,7 @@
       </w:r>
     </w:p>
     <w:bookmarkEnd w:id="15"/>
-    <w:bookmarkStart w:id="41" w:name="sec:architecture"/>
+    <w:bookmarkStart w:id="42" w:name="sec:architecture"/>
     <w:p>
       <w:pPr>
         <w:pStyle w:val="Heading1"/>
@@ -1328,13 +1328,25 @@
         <w:t xml:space="preserve"> </w:t>
       </w:r>
       <w:r>
-        <w:t xml:space="preserve">evaluation, and execution. Arrows indicate recorded processing relationships,</w:t>
-      </w:r>
-      <w:r>
-        <w:t xml:space="preserve"> </w:t>
-      </w:r>
-      <w:r>
-        <w:t xml:space="preserve">not automatic trust propagation.</w:t>
+        <w:t xml:space="preserve">evaluation, and execution. Core 4.1 persists scope-tagged records through a</w:t>
+      </w:r>
+      <w:r>
+        <w:t xml:space="preserve"> </w:t>
+      </w:r>
+      <w:r>
+        <w:t xml:space="preserve">transactional store; HAV verifies candidate text against supplied state; GRDI</w:t>
+      </w:r>
+      <w:r>
+        <w:t xml:space="preserve"> </w:t>
+      </w:r>
+      <w:r>
+        <w:t xml:space="preserve">appends a shadow decision chain through the same store. Arrows indicate</w:t>
+      </w:r>
+      <w:r>
+        <w:t xml:space="preserve"> </w:t>
+      </w:r>
+      <w:r>
+        <w:t xml:space="preserve">recorded processing relationships, not automatic trust propagation.</w:t>
       </w:r>
     </w:p>
     <w:bookmarkEnd w:id="16"/>
@@ -1911,7 +1923,7 @@
       </w:r>
     </w:p>
     <w:bookmarkEnd w:id="19"/>
-    <w:bookmarkStart w:id="26" w:name="sec:transactional-ledger"/>
+    <w:bookmarkStart w:id="27" w:name="sec:transactional-ledger"/>
     <w:p>
       <w:pPr>
         <w:pStyle w:val="Heading2"/>
@@ -1947,306 +1959,19 @@
         <w:t xml:space="preserve"> </w:t>
       </w:r>
       <w:r>
-        <w:t xml:space="preserve">multi-tenant deployments. Business records are keyed by</w:t>
-      </w:r>
-      <w:r>
-        <w:t xml:space="preserve"> </w:t>
-      </w:r>
-      <m:oMath>
-        <m:r>
-          <m:rPr>
-            <m:sty m:val="p"/>
-          </m:rPr>
-          <m:t>(</m:t>
-        </m:r>
-        <m:r>
-          <m:rPr>
-            <m:sty m:val="i"/>
-          </m:rPr>
-          <m:t>t</m:t>
-        </m:r>
-        <m:r>
-          <m:rPr>
-            <m:sty m:val="i"/>
-          </m:rPr>
-          <m:t>e</m:t>
-        </m:r>
-        <m:r>
-          <m:rPr>
-            <m:sty m:val="i"/>
-          </m:rPr>
-          <m:t>n</m:t>
-        </m:r>
-        <m:r>
-          <m:rPr>
-            <m:sty m:val="i"/>
-          </m:rPr>
-          <m:t>a</m:t>
-        </m:r>
-        <m:r>
-          <m:rPr>
-            <m:sty m:val="i"/>
-          </m:rPr>
-          <m:t>n</m:t>
-        </m:r>
-        <m:r>
-          <m:rPr>
-            <m:sty m:val="i"/>
-          </m:rPr>
-          <m:t>t</m:t>
-        </m:r>
-        <m:r>
-          <m:rPr>
-            <m:sty m:val="i"/>
-          </m:rPr>
-          <m:t>_</m:t>
-        </m:r>
-        <m:r>
-          <m:rPr>
-            <m:sty m:val="i"/>
-          </m:rPr>
-          <m:t>i</m:t>
-        </m:r>
-        <m:r>
-          <m:rPr>
-            <m:sty m:val="i"/>
-          </m:rPr>
-          <m:t>d</m:t>
-        </m:r>
-        <m:r>
-          <m:rPr>
-            <m:sty m:val="p"/>
-          </m:rPr>
-          <m:t>,</m:t>
-        </m:r>
-        <m:r>
-          <m:rPr>
-            <m:sty m:val="i"/>
-          </m:rPr>
-          <m:t>p</m:t>
-        </m:r>
-        <m:r>
-          <m:rPr>
-            <m:sty m:val="i"/>
-          </m:rPr>
-          <m:t>r</m:t>
-        </m:r>
-        <m:r>
-          <m:rPr>
-            <m:sty m:val="i"/>
-          </m:rPr>
-          <m:t>o</m:t>
-        </m:r>
-        <m:r>
-          <m:rPr>
-            <m:sty m:val="i"/>
-          </m:rPr>
-          <m:t>j</m:t>
-        </m:r>
-        <m:r>
-          <m:rPr>
-            <m:sty m:val="i"/>
-          </m:rPr>
-          <m:t>e</m:t>
-        </m:r>
-        <m:r>
-          <m:rPr>
-            <m:sty m:val="i"/>
-          </m:rPr>
-          <m:t>c</m:t>
-        </m:r>
-        <m:r>
-          <m:rPr>
-            <m:sty m:val="i"/>
-          </m:rPr>
-          <m:t>t</m:t>
-        </m:r>
-        <m:r>
-          <m:rPr>
-            <m:sty m:val="i"/>
-          </m:rPr>
-          <m:t>_</m:t>
-        </m:r>
-        <m:r>
-          <m:rPr>
-            <m:sty m:val="i"/>
-          </m:rPr>
-          <m:t>i</m:t>
-        </m:r>
-        <m:r>
-          <m:rPr>
-            <m:sty m:val="i"/>
-          </m:rPr>
-          <m:t>d</m:t>
-        </m:r>
-        <m:r>
-          <m:rPr>
-            <m:sty m:val="p"/>
-          </m:rPr>
-          <m:t>,</m:t>
-        </m:r>
-        <m:r>
-          <m:rPr>
-            <m:sty m:val="i"/>
-          </m:rPr>
-          <m:t>c</m:t>
-        </m:r>
-        <m:r>
-          <m:rPr>
-            <m:sty m:val="i"/>
-          </m:rPr>
-          <m:t>o</m:t>
-        </m:r>
-        <m:r>
-          <m:rPr>
-            <m:sty m:val="i"/>
-          </m:rPr>
-          <m:t>l</m:t>
-        </m:r>
-        <m:r>
-          <m:rPr>
-            <m:sty m:val="i"/>
-          </m:rPr>
-          <m:t>l</m:t>
-        </m:r>
-        <m:r>
-          <m:rPr>
-            <m:sty m:val="i"/>
-          </m:rPr>
-          <m:t>e</m:t>
-        </m:r>
-        <m:r>
-          <m:rPr>
-            <m:sty m:val="i"/>
-          </m:rPr>
-          <m:t>c</m:t>
-        </m:r>
-        <m:r>
-          <m:rPr>
-            <m:sty m:val="i"/>
-          </m:rPr>
-          <m:t>t</m:t>
-        </m:r>
-        <m:r>
-          <m:rPr>
-            <m:sty m:val="i"/>
-          </m:rPr>
-          <m:t>i</m:t>
-        </m:r>
-        <m:r>
-          <m:rPr>
-            <m:sty m:val="i"/>
-          </m:rPr>
-          <m:t>o</m:t>
-        </m:r>
-        <m:r>
-          <m:rPr>
-            <m:sty m:val="i"/>
-          </m:rPr>
-          <m:t>n</m:t>
-        </m:r>
-        <m:r>
-          <m:rPr>
-            <m:sty m:val="p"/>
-          </m:rPr>
-          <m:t>,</m:t>
-        </m:r>
-        <m:r>
-          <m:rPr>
-            <m:sty m:val="i"/>
-          </m:rPr>
-          <m:t>c</m:t>
-        </m:r>
-        <m:r>
-          <m:rPr>
-            <m:sty m:val="i"/>
-          </m:rPr>
-          <m:t>a</m:t>
-        </m:r>
-        <m:r>
-          <m:rPr>
-            <m:sty m:val="i"/>
-          </m:rPr>
-          <m:t>n</m:t>
-        </m:r>
-        <m:r>
-          <m:rPr>
-            <m:sty m:val="i"/>
-          </m:rPr>
-          <m:t>o</m:t>
-        </m:r>
-        <m:r>
-          <m:rPr>
-            <m:sty m:val="i"/>
-          </m:rPr>
-          <m:t>n</m:t>
-        </m:r>
-        <m:r>
-          <m:rPr>
-            <m:sty m:val="i"/>
-          </m:rPr>
-          <m:t>i</m:t>
-        </m:r>
-        <m:r>
-          <m:rPr>
-            <m:sty m:val="i"/>
-          </m:rPr>
-          <m:t>c</m:t>
-        </m:r>
-        <m:r>
-          <m:rPr>
-            <m:sty m:val="i"/>
-          </m:rPr>
-          <m:t>a</m:t>
-        </m:r>
-        <m:r>
-          <m:rPr>
-            <m:sty m:val="i"/>
-          </m:rPr>
-          <m:t>l</m:t>
-        </m:r>
-        <m:r>
-          <m:rPr>
-            <m:sty m:val="i"/>
-          </m:rPr>
-          <m:t>_</m:t>
-        </m:r>
-        <m:r>
-          <m:rPr>
-            <m:sty m:val="i"/>
-          </m:rPr>
-          <m:t>k</m:t>
-        </m:r>
-        <m:r>
-          <m:rPr>
-            <m:sty m:val="i"/>
-          </m:rPr>
-          <m:t>e</m:t>
-        </m:r>
-        <m:r>
-          <m:rPr>
-            <m:sty m:val="i"/>
-          </m:rPr>
-          <m:t>y</m:t>
-        </m:r>
-        <m:r>
-          <m:rPr>
-            <m:sty m:val="p"/>
-          </m:rPr>
-          <m:t>)</m:t>
-        </m:r>
-      </m:oMath>
-      <w:r>
-        <w:t xml:space="preserve"> </w:t>
-      </w:r>
-      <w:r>
-        <w:t xml:space="preserve">and stored with an explicit payload hash,</w:t>
-      </w:r>
-      <w:r>
-        <w:t xml:space="preserve"> </w:t>
-      </w:r>
-      <w:r>
-        <w:t xml:space="preserve">chain metadata, and row version. The public API exposes</w:t>
+        <w:t xml:space="preserve">multi-tenant deployments. Business records are keyed by tenant, project,</w:t>
+      </w:r>
+      <w:r>
+        <w:t xml:space="preserve"> </w:t>
+      </w:r>
+      <w:r>
+        <w:t xml:space="preserve">collection, and canonical business key, and stored with an explicit payload</w:t>
+      </w:r>
+      <w:r>
+        <w:t xml:space="preserve"> </w:t>
+      </w:r>
+      <w:r>
+        <w:t xml:space="preserve">hash, chain metadata, and row version. The public API exposes</w:t>
       </w:r>
       <w:r>
         <w:t xml:space="preserve"> </w:t>
@@ -2333,13 +2058,13 @@
         <w:t xml:space="preserve"> </w:t>
       </w:r>
       <w:r>
-        <w:t xml:space="preserve">operation recomputes hashes, chain continuity,</w:t>
-      </w:r>
-      <w:r>
-        <w:t xml:space="preserve"> </w:t>
-      </w:r>
-      <w:r>
-        <w:t xml:space="preserve">and chain-head consistency without repairing data.</w:t>
+        <w:t xml:space="preserve">operation recomputes hashes, chain continuity, and chain-head consistency</w:t>
+      </w:r>
+      <w:r>
+        <w:t xml:space="preserve"> </w:t>
+      </w:r>
+      <w:r>
+        <w:t xml:space="preserve">without repairing data.</w:t>
       </w:r>
     </w:p>
     <w:bookmarkStart w:id="20" w:name="write-locks."/>
@@ -2460,25 +2185,19 @@
         <w:t xml:space="preserve"> </w:t>
       </w:r>
       <w:r>
-        <w:t xml:space="preserve">accepts a</w:t>
-      </w:r>
-      <w:r>
-        <w:t xml:space="preserve"> </w:t>
-      </w:r>
-      <w:r>
-        <w:t xml:space="preserve">callback that performs multiple scoped operations under one commit boundary.</w:t>
-      </w:r>
-      <w:r>
-        <w:t xml:space="preserve"> </w:t>
-      </w:r>
-      <w:r>
-        <w:t xml:space="preserve">On the JSON backend, writes are staged in thread-local state and flushed on</w:t>
-      </w:r>
-      <w:r>
-        <w:t xml:space="preserve"> </w:t>
-      </w:r>
-      <w:r>
-        <w:t xml:space="preserve">success;</w:t>
+        <w:t xml:space="preserve">accepts a callback that performs multiple</w:t>
+      </w:r>
+      <w:r>
+        <w:t xml:space="preserve"> </w:t>
+      </w:r>
+      <w:r>
+        <w:t xml:space="preserve">scoped operations under one commit boundary. On the JSON backend, writes are</w:t>
+      </w:r>
+      <w:r>
+        <w:t xml:space="preserve"> </w:t>
+      </w:r>
+      <w:r>
+        <w:t xml:space="preserve">staged in thread-local state and flushed on success;</w:t>
       </w:r>
       <w:r>
         <w:t xml:space="preserve"> </w:t>
@@ -2493,13 +2212,13 @@
         <w:t xml:space="preserve"> </w:t>
       </w:r>
       <w:r>
-        <w:t xml:space="preserve">is rejected fail-closed</w:t>
-      </w:r>
-      <w:r>
-        <w:t xml:space="preserve"> </w:t>
-      </w:r>
-      <w:r>
-        <w:t xml:space="preserve">because cross-process file locking is not provided. On SQLite, the engine uses</w:t>
+        <w:t xml:space="preserve">is rejected fail-closed because</w:t>
+      </w:r>
+      <w:r>
+        <w:t xml:space="preserve"> </w:t>
+      </w:r>
+      <w:r>
+        <w:t xml:space="preserve">cross-process file locking is not provided. On SQLite, the engine uses</w:t>
       </w:r>
       <w:r>
         <w:t xml:space="preserve"> </w:t>
@@ -2574,13 +2293,13 @@
         <w:t xml:space="preserve"> </w:t>
       </w:r>
       <w:r>
-        <w:t xml:space="preserve">groups rows</w:t>
-      </w:r>
-      <w:r>
-        <w:t xml:space="preserve"> </w:t>
-      </w:r>
-      <w:r>
-        <w:t xml:space="preserve">by scope and collection, validates that internal columns match each record’s</w:t>
+        <w:t xml:space="preserve">groups rows by scope and collection, validates</w:t>
+      </w:r>
+      <w:r>
+        <w:t xml:space="preserve"> </w:t>
+      </w:r>
+      <w:r>
+        <w:t xml:space="preserve">that internal columns match each record’s</w:t>
       </w:r>
       <w:r>
         <w:t xml:space="preserve"> </w:t>
@@ -2595,13 +2314,19 @@
         <w:t xml:space="preserve"> </w:t>
       </w:r>
       <w:r>
-        <w:t xml:space="preserve">metadata, checks payload hashes, detects missing or orphan</w:t>
-      </w:r>
-      <w:r>
-        <w:t xml:space="preserve"> </w:t>
-      </w:r>
-      <w:r>
-        <w:t xml:space="preserve">chain heads, and rejects sequence gaps. The check is</w:t>
+        <w:t xml:space="preserve">metadata, checks</w:t>
+      </w:r>
+      <w:r>
+        <w:t xml:space="preserve"> </w:t>
+      </w:r>
+      <w:r>
+        <w:t xml:space="preserve">payload hashes, detects missing or orphan chain heads, and rejects sequence</w:t>
+      </w:r>
+      <w:r>
+        <w:t xml:space="preserve"> </w:t>
+      </w:r>
+      <w:r>
+        <w:t xml:space="preserve">gaps. The check is</w:t>
       </w:r>
       <w:r>
         <w:t xml:space="preserve"> </w:t>
@@ -2614,13 +2339,7 @@
         <w:t xml:space="preserve">fail-closed</w:t>
       </w:r>
       <w:r>
-        <w:t xml:space="preserve">: any</w:t>
-      </w:r>
-      <w:r>
-        <w:t xml:space="preserve"> </w:t>
-      </w:r>
-      <w:r>
-        <w:t xml:space="preserve">tamper or inconsistency raises</w:t>
+        <w:t xml:space="preserve">: any tamper or inconsistency raises</w:t>
       </w:r>
       <w:r>
         <w:t xml:space="preserve"> </w:t>
@@ -2648,13 +2367,19 @@
         <w:t xml:space="preserve"> </w:t>
       </w:r>
       <w:r>
-        <w:t xml:space="preserve">for JSON and SQLite in the current release; a PostgreSQL</w:t>
-      </w:r>
-      <w:r>
-        <w:t xml:space="preserve"> </w:t>
-      </w:r>
-      <w:r>
-        <w:t xml:space="preserve">backend with the same semantics is</w:t>
+        <w:t xml:space="preserve">for JSON</w:t>
+      </w:r>
+      <w:r>
+        <w:t xml:space="preserve"> </w:t>
+      </w:r>
+      <w:r>
+        <w:t xml:space="preserve">and SQLite in the current release; a PostgreSQL backend with the same semantics</w:t>
+      </w:r>
+      <w:r>
+        <w:t xml:space="preserve"> </w:t>
+      </w:r>
+      <w:r>
+        <w:t xml:space="preserve">is</w:t>
       </w:r>
       <w:r>
         <w:t xml:space="preserve"> </w:t>
@@ -2742,7 +2467,7 @@
     </w:p>
     <w:bookmarkEnd w:id="22"/>
     <w:bookmarkEnd w:id="23"/>
-    <w:bookmarkStart w:id="25" w:name="chain-linked-versus-mutable-collections."/>
+    <w:bookmarkStart w:id="26" w:name="chain-linked-versus-mutable-collections."/>
     <w:p>
       <w:pPr>
         <w:pStyle w:val="Heading4"/>
@@ -2947,9 +2672,80 @@
       </w:r>
     </w:p>
     <w:bookmarkEnd w:id="24"/>
+    <w:p>
+      <w:pPr>
+        <w:pStyle w:val="BodyText"/>
+      </w:pPr>
+      <w:r>
+        <w:t xml:space="preserve">Figure </w:t>
+      </w:r>
+      <w:hyperlink w:anchor="fig:verify-scoped-chain">
+        <w:r>
+          <w:rPr>
+            <w:rStyle w:val="Hyperlink"/>
+          </w:rPr>
+          <w:t xml:space="preserve">5</w:t>
+        </w:r>
+      </w:hyperlink>
+      <w:r>
+        <w:t xml:space="preserve"> </w:t>
+      </w:r>
+      <w:r>
+        <w:t xml:space="preserve">summarizes the fail-closed read path.</w:t>
+      </w:r>
+    </w:p>
+    <w:bookmarkStart w:id="25" w:name="fig:verify-scoped-chain"/>
+    <w:tbl>
+      <w:tblPr>
+        <w:tblStyle w:val="FigureTable"/>
+        <w:tblW w:type="auto" w:w="0"/>
+        <w:jc w:val="center"/>
+        <w:tblLook w:firstRow="0" w:lastRow="0" w:firstColumn="0" w:lastColumn="0"/>
+      </w:tblPr>
+      <w:tblGrid/>
+    </w:tbl>
+    <w:p>
+      <w:pPr>
+        <w:pStyle w:val="ImageCaption"/>
+      </w:pPr>
+      <w:r>
+        <w:rPr>
+          <w:rStyle w:val="VerbatimChar"/>
+        </w:rPr>
+        <w:t xml:space="preserve">verify_scoped_chain</w:t>
+      </w:r>
+      <w:r>
+        <w:t xml:space="preserve"> </w:t>
+      </w:r>
+      <w:r>
+        <w:t xml:space="preserve">recomputes hashes and chain metadata,</w:t>
+      </w:r>
+      <w:r>
+        <w:t xml:space="preserve"> </w:t>
+      </w:r>
+      <w:r>
+        <w:t xml:space="preserve">checks head pointers and sequence continuity, and raises</w:t>
+      </w:r>
+      <w:r>
+        <w:t xml:space="preserve"> </w:t>
+      </w:r>
+      <w:r>
+        <w:rPr>
+          <w:rStyle w:val="VerbatimChar"/>
+        </w:rPr>
+        <w:t xml:space="preserve">LedgerIntegrityError</w:t>
+      </w:r>
+      <w:r>
+        <w:t xml:space="preserve"> </w:t>
+      </w:r>
+      <w:r>
+        <w:t xml:space="preserve">on any inconsistency.</w:t>
+      </w:r>
+    </w:p>
     <w:bookmarkEnd w:id="25"/>
     <w:bookmarkEnd w:id="26"/>
-    <w:bookmarkStart w:id="27" w:name="policy-gated-runtime"/>
+    <w:bookmarkEnd w:id="27"/>
+    <w:bookmarkStart w:id="28" w:name="policy-gated-runtime"/>
     <w:p>
       <w:pPr>
         <w:pStyle w:val="Heading2"/>
@@ -3398,72 +3194,6 @@
         <w:t xml:space="preserve">deployment does not grant arbitrary external execution.</w:t>
       </w:r>
     </w:p>
-    <w:bookmarkEnd w:id="27"/>
-    <w:bookmarkStart w:id="28" w:name="api-sdk-and-operations"/>
-    <w:p>
-      <w:pPr>
-        <w:pStyle w:val="Heading2"/>
-      </w:pPr>
-      <w:r>
-        <w:t xml:space="preserve">API, SDK, and operations</w:t>
-      </w:r>
-    </w:p>
-    <w:p>
-      <w:pPr>
-        <w:pStyle w:val="FirstParagraph"/>
-      </w:pPr>
-      <w:r>
-        <w:t xml:space="preserve">The Python SDK can send tenant and project headers, API-key or bearer</w:t>
-      </w:r>
-      <w:r>
-        <w:t xml:space="preserve"> </w:t>
-      </w:r>
-      <w:r>
-        <w:t xml:space="preserve">credentials, and idempotency keys. Authentication, PostgreSQL persistence, and</w:t>
-      </w:r>
-      <w:r>
-        <w:t xml:space="preserve"> </w:t>
-      </w:r>
-      <w:r>
-        <w:t xml:space="preserve">signing are supported by lower-level Core components when explicitly</w:t>
-      </w:r>
-      <w:r>
-        <w:t xml:space="preserve"> </w:t>
-      </w:r>
-      <w:r>
-        <w:t xml:space="preserve">configured. The packaged application does not currently wire every one of</w:t>
-      </w:r>
-      <w:r>
-        <w:t xml:space="preserve"> </w:t>
-      </w:r>
-      <w:r>
-        <w:t xml:space="preserve">these options into the Core v3 router. Its Docker configuration must therefore</w:t>
-      </w:r>
-      <w:r>
-        <w:t xml:space="preserve"> </w:t>
-      </w:r>
-      <w:r>
-        <w:t xml:space="preserve">be treated as a local evaluation setup unless protected by an external</w:t>
-      </w:r>
-      <w:r>
-        <w:t xml:space="preserve"> </w:t>
-      </w:r>
-      <w:r>
-        <w:t xml:space="preserve">authentication and network boundary. Scope headers are application metadata</w:t>
-      </w:r>
-      <w:r>
-        <w:t xml:space="preserve"> </w:t>
-      </w:r>
-      <w:r>
-        <w:t xml:space="preserve">and query filters; the present implementation does not provide end-to-end</w:t>
-      </w:r>
-      <w:r>
-        <w:t xml:space="preserve"> </w:t>
-      </w:r>
-      <w:r>
-        <w:t xml:space="preserve">tenant isolation or same-scope referential-integrity guarantees.</w:t>
-      </w:r>
-    </w:p>
     <w:bookmarkEnd w:id="28"/>
     <w:bookmarkStart w:id="36" w:name="sec:hav"/>
     <w:p>
@@ -3662,7 +3392,7 @@
           <w:rPr>
             <w:rStyle w:val="Hyperlink"/>
           </w:rPr>
-          <w:t xml:space="preserve">5</w:t>
+          <w:t xml:space="preserve">6</w:t>
         </w:r>
       </w:hyperlink>
       <w:r>
@@ -3718,7 +3448,7 @@
           <w:rPr>
             <w:rStyle w:val="Hyperlink"/>
           </w:rPr>
-          <w:t xml:space="preserve">6</w:t>
+          <w:t xml:space="preserve">7</w:t>
         </w:r>
       </w:hyperlink>
       <w:r>
@@ -3809,7 +3539,7 @@
           <w:rPr>
             <w:rStyle w:val="Hyperlink"/>
           </w:rPr>
-          <w:t xml:space="preserve">6</w:t>
+          <w:t xml:space="preserve">7</w:t>
         </w:r>
       </w:hyperlink>
       <w:r>
@@ -4588,7 +4318,13 @@
         <w:t xml:space="preserve">NOT_VERIFIED</w:t>
       </w:r>
       <w:r>
-        <w:t xml:space="preserve">), authorization (</w:t>
+        <w:t xml:space="preserve">), authorization</w:t>
+      </w:r>
+      <w:r>
+        <w:t xml:space="preserve"> </w:t>
+      </w:r>
+      <w:r>
+        <w:t xml:space="preserve">(</w:t>
       </w:r>
       <w:r>
         <w:rPr>
@@ -4597,10 +4333,7 @@
         <w:t xml:space="preserve">AUTHORIZED</w:t>
       </w:r>
       <w:r>
-        <w:t xml:space="preserve"> </w:t>
-      </w:r>
-      <w:r>
-        <w:t xml:space="preserve">/</w:t>
+        <w:t xml:space="preserve">,</w:t>
       </w:r>
       <w:r>
         <w:t xml:space="preserve"> </w:t>
@@ -4612,10 +4345,7 @@
         <w:t xml:space="preserve">NOT_AUTHORIZED</w:t>
       </w:r>
       <w:r>
-        <w:t xml:space="preserve"> </w:t>
-      </w:r>
-      <w:r>
-        <w:t xml:space="preserve">/</w:t>
+        <w:t xml:space="preserve">, or</w:t>
       </w:r>
       <w:r>
         <w:t xml:space="preserve"> </w:t>
@@ -4627,13 +4357,7 @@
         <w:t xml:space="preserve">REQUIRES_APPROVAL</w:t>
       </w:r>
       <w:r>
-        <w:t xml:space="preserve">), and execution</w:t>
-      </w:r>
-      <w:r>
-        <w:t xml:space="preserve"> </w:t>
-      </w:r>
-      <w:r>
-        <w:t xml:space="preserve">(</w:t>
+        <w:t xml:space="preserve">), and execution (</w:t>
       </w:r>
       <w:r>
         <w:rPr>
@@ -4645,25 +4369,25 @@
         <w:t xml:space="preserve"> </w:t>
       </w:r>
       <w:r>
-        <w:t xml:space="preserve">throughout Foundation and shadow increments) are</w:t>
-      </w:r>
-      <w:r>
-        <w:t xml:space="preserve"> </w:t>
-      </w:r>
-      <w:r>
-        <w:t xml:space="preserve">stored as distinct fields. A passing HAV receipt does not by itself authorize</w:t>
-      </w:r>
-      <w:r>
-        <w:t xml:space="preserve"> </w:t>
-      </w:r>
-      <w:r>
-        <w:t xml:space="preserve">an action; an authorized envelope does not imply that an external action was</w:t>
-      </w:r>
-      <w:r>
-        <w:t xml:space="preserve"> </w:t>
-      </w:r>
-      <w:r>
-        <w:t xml:space="preserve">executed. The shadow execution gateway may record</w:t>
+        <w:t xml:space="preserve">throughout Foundation and shadow increments) are stored as distinct fields.</w:t>
+      </w:r>
+      <w:r>
+        <w:t xml:space="preserve"> </w:t>
+      </w:r>
+      <w:r>
+        <w:t xml:space="preserve">A passing HAV receipt does not by itself authorize an action; an authorized</w:t>
+      </w:r>
+      <w:r>
+        <w:t xml:space="preserve"> </w:t>
+      </w:r>
+      <w:r>
+        <w:t xml:space="preserve">envelope does not imply that an external action was executed. The shadow</w:t>
+      </w:r>
+      <w:r>
+        <w:t xml:space="preserve"> </w:t>
+      </w:r>
+      <w:r>
+        <w:t xml:space="preserve">execution gateway may record</w:t>
       </w:r>
       <w:r>
         <w:t xml:space="preserve"> </w:t>
@@ -4678,13 +4402,13 @@
         <w:t xml:space="preserve"> </w:t>
       </w:r>
       <w:r>
-        <w:t xml:space="preserve">plans and</w:t>
-      </w:r>
-      <w:r>
-        <w:t xml:space="preserve"> </w:t>
-      </w:r>
-      <w:r>
-        <w:t xml:space="preserve">signed receipts while preserving</w:t>
+        <w:t xml:space="preserve">plans and signed receipts</w:t>
+      </w:r>
+      <w:r>
+        <w:t xml:space="preserve"> </w:t>
+      </w:r>
+      <w:r>
+        <w:t xml:space="preserve">while preserving</w:t>
       </w:r>
       <w:r>
         <w:t xml:space="preserve"> </w:t>
@@ -4714,7 +4438,7 @@
         <w:pStyle w:val="FirstParagraph"/>
       </w:pPr>
       <w:r>
-        <w:t xml:space="preserve">A typical shadow path appends, in order:</w:t>
+        <w:t xml:space="preserve">A typical shadow path appends, in order: a</w:t>
       </w:r>
       <w:r>
         <w:t xml:space="preserve"> </w:t>
@@ -4729,7 +4453,13 @@
         <w:t xml:space="preserve"> </w:t>
       </w:r>
       <w:r>
-        <w:t xml:space="preserve">(HAV receipt and proposed action),</w:t>
+        <w:t xml:space="preserve">(HAV</w:t>
+      </w:r>
+      <w:r>
+        <w:t xml:space="preserve"> </w:t>
+      </w:r>
+      <w:r>
+        <w:t xml:space="preserve">receipt and proposed action), an</w:t>
       </w:r>
       <w:r>
         <w:t xml:space="preserve"> </w:t>
@@ -4741,7 +4471,7 @@
         <w:t xml:space="preserve">AuthorityDecision</w:t>
       </w:r>
       <w:r>
-        <w:t xml:space="preserve">,</w:t>
+        <w:t xml:space="preserve">, an</w:t>
       </w:r>
       <w:r>
         <w:t xml:space="preserve"> </w:t>
@@ -4753,7 +4483,7 @@
         <w:t xml:space="preserve">ExecutionRequest</w:t>
       </w:r>
       <w:r>
-        <w:t xml:space="preserve">,</w:t>
+        <w:t xml:space="preserve">, a</w:t>
       </w:r>
       <w:r>
         <w:t xml:space="preserve"> </w:t>
@@ -4765,7 +4495,7 @@
         <w:t xml:space="preserve">GatewayDecision</w:t>
       </w:r>
       <w:r>
-        <w:t xml:space="preserve">, optional</w:t>
+        <w:t xml:space="preserve">, an optional</w:t>
       </w:r>
       <w:r>
         <w:t xml:space="preserve"> </w:t>
@@ -4777,7 +4507,7 @@
         <w:t xml:space="preserve">GatewayDecisionEvent</w:t>
       </w:r>
       <w:r>
-        <w:t xml:space="preserve">,</w:t>
+        <w:t xml:space="preserve">, a</w:t>
       </w:r>
       <w:r>
         <w:t xml:space="preserve"> </w:t>
@@ -4789,7 +4519,7 @@
         <w:t xml:space="preserve">ShadowExecutionReceipt</w:t>
       </w:r>
       <w:r>
-        <w:t xml:space="preserve">, and</w:t>
+        <w:t xml:space="preserve">, and a</w:t>
       </w:r>
       <w:r>
         <w:t xml:space="preserve"> </w:t>
@@ -4801,13 +4531,7 @@
         <w:t xml:space="preserve">ShadowOutcomeRecord</w:t>
       </w:r>
       <w:r>
-        <w:t xml:space="preserve">. Replay</w:t>
-      </w:r>
-      <w:r>
-        <w:t xml:space="preserve"> </w:t>
-      </w:r>
-      <w:r>
-        <w:t xml:space="preserve">audit appends</w:t>
+        <w:t xml:space="preserve">. Replay audit appends</w:t>
       </w:r>
       <w:r>
         <w:t xml:space="preserve"> </w:t>
@@ -4837,19 +4561,19 @@
         <w:t xml:space="preserve"> </w:t>
       </w:r>
       <w:r>
-        <w:t xml:space="preserve">records that re-verify the stored chain without re-running simulation or</w:t>
-      </w:r>
-      <w:r>
-        <w:t xml:space="preserve"> </w:t>
-      </w:r>
-      <w:r>
-        <w:t xml:space="preserve">authority evaluation. Invalid signatures, scope mismatches, or broken links</w:t>
-      </w:r>
-      <w:r>
-        <w:t xml:space="preserve"> </w:t>
-      </w:r>
-      <w:r>
-        <w:t xml:space="preserve">fail closed into explicit</w:t>
+        <w:t xml:space="preserve">records that re-verify the stored chain without</w:t>
+      </w:r>
+      <w:r>
+        <w:t xml:space="preserve"> </w:t>
+      </w:r>
+      <w:r>
+        <w:t xml:space="preserve">re-running simulation or authority evaluation. Invalid signatures, scope</w:t>
+      </w:r>
+      <w:r>
+        <w:t xml:space="preserve"> </w:t>
+      </w:r>
+      <w:r>
+        <w:t xml:space="preserve">mismatches, or broken links fail closed into explicit</w:t>
       </w:r>
       <w:r>
         <w:t xml:space="preserve"> </w:t>
@@ -4879,13 +4603,7 @@
         <w:t xml:space="preserve"> </w:t>
       </w:r>
       <w:r>
-        <w:t xml:space="preserve">replay</w:t>
-      </w:r>
-      <w:r>
-        <w:t xml:space="preserve"> </w:t>
-      </w:r>
-      <w:r>
-        <w:t xml:space="preserve">states; replay never calls chain repair routines.</w:t>
+        <w:t xml:space="preserve">replay states; replay never calls chain repair routines.</w:t>
       </w:r>
     </w:p>
     <w:p>
@@ -4900,7 +4618,7 @@
           <w:rPr>
             <w:rStyle w:val="Hyperlink"/>
           </w:rPr>
-          <w:t xml:space="preserve">7</w:t>
+          <w:t xml:space="preserve">8</w:t>
         </w:r>
       </w:hyperlink>
       <w:r>
@@ -4992,8 +4710,92 @@
     <w:bookmarkEnd w:id="38"/>
     <w:bookmarkEnd w:id="39"/>
     <w:bookmarkEnd w:id="40"/>
+    <w:bookmarkStart w:id="41" w:name="sec:api"/>
+    <w:p>
+      <w:pPr>
+        <w:pStyle w:val="Heading2"/>
+      </w:pPr>
+      <w:r>
+        <w:t xml:space="preserve">API, SDK, and operations</w:t>
+      </w:r>
+    </w:p>
+    <w:p>
+      <w:pPr>
+        <w:pStyle w:val="FirstParagraph"/>
+      </w:pPr>
+      <w:r>
+        <w:t xml:space="preserve">The Python SDK can send tenant and project headers, API-key or bearer</w:t>
+      </w:r>
+      <w:r>
+        <w:t xml:space="preserve"> </w:t>
+      </w:r>
+      <w:r>
+        <w:t xml:space="preserve">credentials, and idempotency keys. Authentication, PostgreSQL persistence, and</w:t>
+      </w:r>
+      <w:r>
+        <w:t xml:space="preserve"> </w:t>
+      </w:r>
+      <w:r>
+        <w:t xml:space="preserve">signing are supported by lower-level Core components when explicitly</w:t>
+      </w:r>
+      <w:r>
+        <w:t xml:space="preserve"> </w:t>
+      </w:r>
+      <w:r>
+        <w:t xml:space="preserve">configured. The packaged application does not currently wire every one of</w:t>
+      </w:r>
+      <w:r>
+        <w:t xml:space="preserve"> </w:t>
+      </w:r>
+      <w:r>
+        <w:t xml:space="preserve">these options into the Core v3 router. Its Docker configuration must therefore</w:t>
+      </w:r>
+      <w:r>
+        <w:t xml:space="preserve"> </w:t>
+      </w:r>
+      <w:r>
+        <w:t xml:space="preserve">be treated as a local evaluation setup unless protected by an external</w:t>
+      </w:r>
+      <w:r>
+        <w:t xml:space="preserve"> </w:t>
+      </w:r>
+      <w:r>
+        <w:t xml:space="preserve">authentication and network boundary. Scope headers are application metadata</w:t>
+      </w:r>
+      <w:r>
+        <w:t xml:space="preserve"> </w:t>
+      </w:r>
+      <w:r>
+        <w:t xml:space="preserve">and query filters; the present implementation does not provide end-to-end</w:t>
+      </w:r>
+      <w:r>
+        <w:t xml:space="preserve"> </w:t>
+      </w:r>
+      <w:r>
+        <w:t xml:space="preserve">tenant isolation or same-scope referential-integrity guarantees. HAV and GRDI</w:t>
+      </w:r>
+      <w:r>
+        <w:t xml:space="preserve"> </w:t>
+      </w:r>
+      <w:r>
+        <w:t xml:space="preserve">HTTP surfaces inherit the same deployment boundary: optional API keys on HAV</w:t>
+      </w:r>
+      <w:r>
+        <w:t xml:space="preserve"> </w:t>
+      </w:r>
+      <w:r>
+        <w:t xml:space="preserve">routes, shadow-default runtime configuration, and no live connector execution</w:t>
+      </w:r>
+      <w:r>
+        <w:t xml:space="preserve"> </w:t>
+      </w:r>
+      <w:r>
+        <w:t xml:space="preserve">in the packaged stack.</w:t>
+      </w:r>
+    </w:p>
     <w:bookmarkEnd w:id="41"/>
-    <w:bookmarkStart w:id="50" w:name="evaluation"/>
+    <w:bookmarkEnd w:id="42"/>
+    <w:bookmarkStart w:id="51" w:name="evaluation"/>
     <w:p>
       <w:pPr>
         <w:pStyle w:val="Heading1"/>
@@ -5002,7 +4804,7 @@
         <w:t xml:space="preserve">Evaluation</w:t>
       </w:r>
     </w:p>
-    <w:bookmarkStart w:id="42" w:name="research-questions"/>
+    <w:bookmarkStart w:id="43" w:name="research-questions"/>
     <w:p>
       <w:pPr>
         <w:pStyle w:val="Heading2"/>
@@ -5105,8 +4907,8 @@
         <w:t xml:space="preserve">corpus.</w:t>
       </w:r>
     </w:p>
-    <w:bookmarkEnd w:id="42"/>
-    <w:bookmarkStart w:id="43" w:name="software-verification"/>
+    <w:bookmarkEnd w:id="43"/>
+    <w:bookmarkStart w:id="44" w:name="software-verification"/>
     <w:p>
       <w:pPr>
         <w:pStyle w:val="Heading2"/>
@@ -5228,8 +5030,8 @@
         <w:t xml:space="preserve">deployments.</w:t>
       </w:r>
     </w:p>
-    <w:bookmarkEnd w:id="43"/>
-    <w:bookmarkStart w:id="44" w:name="sec:hav-scenarios"/>
+    <w:bookmarkEnd w:id="44"/>
+    <w:bookmarkStart w:id="45" w:name="sec:hav-scenarios"/>
     <w:p>
       <w:pPr>
         <w:pStyle w:val="Heading2"/>
@@ -5373,7 +5175,7 @@
           <w:rPr>
             <w:rStyle w:val="Hyperlink"/>
           </w:rPr>
-          <w:t xml:space="preserve">4.6</w:t>
+          <w:t xml:space="preserve">4.5</w:t>
         </w:r>
       </w:hyperlink>
       <w:r>
@@ -5404,8 +5206,8 @@
         <w:t xml:space="preserve">to generalize beyond the repository-status vocabulary encoded in its rules.</w:t>
       </w:r>
     </w:p>
-    <w:bookmarkEnd w:id="44"/>
-    <w:bookmarkStart w:id="45" w:name="sec:txn-eval"/>
+    <w:bookmarkEnd w:id="45"/>
+    <w:bookmarkStart w:id="46" w:name="sec:txn-eval"/>
     <w:p>
       <w:pPr>
         <w:pStyle w:val="Heading2"/>
@@ -5475,13 +5277,24 @@
         <w:t xml:space="preserve"> </w:t>
       </w:r>
       <w:r>
-        <w:t xml:space="preserve">gaps, column tampering, and coordinated metadata manipulation). These tests</w:t>
-      </w:r>
-      <w:r>
-        <w:t xml:space="preserve"> </w:t>
-      </w:r>
-      <w:r>
-        <w:t xml:space="preserve">establish</w:t>
+        <w:t xml:space="preserve">gaps, column tampering, and coordinated metadata manipulation; see</w:t>
+      </w:r>
+      <w:r>
+        <w:t xml:space="preserve"> </w:t>
+      </w:r>
+      <w:r>
+        <w:t xml:space="preserve">Figure </w:t>
+      </w:r>
+      <w:hyperlink w:anchor="fig:verify-scoped-chain">
+        <w:r>
+          <w:rPr>
+            <w:rStyle w:val="Hyperlink"/>
+          </w:rPr>
+          <w:t xml:space="preserve">5</w:t>
+        </w:r>
+      </w:hyperlink>
+      <w:r>
+        <w:t xml:space="preserve">). These tests establish</w:t>
       </w:r>
       <w:r>
         <w:t xml:space="preserve"> </w:t>
@@ -5512,8 +5325,8 @@
         <w:t xml:space="preserve">unrestricted storage access.</w:t>
       </w:r>
     </w:p>
-    <w:bookmarkEnd w:id="45"/>
-    <w:bookmarkStart w:id="46" w:name="sec:grdi-eval"/>
+    <w:bookmarkEnd w:id="46"/>
+    <w:bookmarkStart w:id="47" w:name="sec:grdi-eval"/>
     <w:p>
       <w:pPr>
         <w:pStyle w:val="Heading2"/>
@@ -5603,8 +5416,8 @@
         <w:t xml:space="preserve">simulations or semantic equivalence between production deployments.</w:t>
       </w:r>
     </w:p>
-    <w:bookmarkEnd w:id="46"/>
-    <w:bookmarkStart w:id="49" w:name="external-anomaly-ranking-experiment"/>
+    <w:bookmarkEnd w:id="47"/>
+    <w:bookmarkStart w:id="50" w:name="external-anomaly-ranking-experiment"/>
     <w:p>
       <w:pPr>
         <w:pStyle w:val="Heading2"/>
@@ -5709,7 +5522,7 @@
         <w:t xml:space="preserve">reproduces the committed result.</w:t>
       </w:r>
     </w:p>
-    <w:bookmarkStart w:id="47" w:name="tab:cicids"/>
+    <w:bookmarkStart w:id="48" w:name="tab:cicids"/>
     <w:p>
       <w:pPr>
         <w:pStyle w:val="TableCaption"/>
@@ -6180,8 +5993,8 @@
         </w:tc>
       </w:tr>
     </w:tbl>
-    <w:bookmarkEnd w:id="47"/>
-    <w:bookmarkStart w:id="48" w:name="fig:cicids-bars"/>
+    <w:bookmarkEnd w:id="48"/>
+    <w:bookmarkStart w:id="49" w:name="fig:cicids-bars"/>
     <w:tbl>
       <w:tblPr>
         <w:tblStyle w:val="FigureTable"/>
@@ -6228,7 +6041,7 @@
         <w:t xml:space="preserve">second, ahead of Isolation Forest and robust deviation.</w:t>
       </w:r>
     </w:p>
-    <w:bookmarkEnd w:id="48"/>
+    <w:bookmarkEnd w:id="49"/>
     <w:p>
       <w:pPr>
         <w:pStyle w:val="BodyText"/>
@@ -6261,9 +6074,9 @@
         <w:t xml:space="preserve">claim of general or state-of-the-art superiority.</w:t>
       </w:r>
     </w:p>
-    <w:bookmarkEnd w:id="49"/>
     <w:bookmarkEnd w:id="50"/>
-    <w:bookmarkStart w:id="58" w:name="threats-to-validity-and-limitations"/>
+    <w:bookmarkEnd w:id="51"/>
+    <w:bookmarkStart w:id="59" w:name="threats-to-validity-and-limitations"/>
     <w:p>
       <w:pPr>
         <w:pStyle w:val="Heading1"/>
@@ -6272,7 +6085,7 @@
         <w:t xml:space="preserve">Threats to Validity and Limitations</w:t>
       </w:r>
     </w:p>
-    <w:bookmarkStart w:id="51" w:name="dataset-validity."/>
+    <w:bookmarkStart w:id="52" w:name="dataset-validity."/>
     <w:p>
       <w:pPr>
         <w:pStyle w:val="Heading4"/>
@@ -6328,8 +6141,8 @@
         <w:t xml:space="preserve">graph for which PhiGraph is designed.</w:t>
       </w:r>
     </w:p>
-    <w:bookmarkEnd w:id="51"/>
-    <w:bookmarkStart w:id="52" w:name="experimental-validity."/>
+    <w:bookmarkEnd w:id="52"/>
+    <w:bookmarkStart w:id="53" w:name="experimental-validity."/>
     <w:p>
       <w:pPr>
         <w:pStyle w:val="Heading4"/>
@@ -6394,8 +6207,8 @@
         <w:t xml:space="preserve">are required.</w:t>
       </w:r>
     </w:p>
-    <w:bookmarkEnd w:id="52"/>
-    <w:bookmarkStart w:id="53" w:name="software-validity."/>
+    <w:bookmarkEnd w:id="53"/>
+    <w:bookmarkStart w:id="54" w:name="software-validity."/>
     <w:p>
       <w:pPr>
         <w:pStyle w:val="Heading4"/>
@@ -6442,8 +6255,8 @@
         <w:t xml:space="preserve">storage, secrets management, authorization, monitoring, and backup procedures.</w:t>
       </w:r>
     </w:p>
-    <w:bookmarkEnd w:id="53"/>
-    <w:bookmarkStart w:id="54" w:name="transactional-ledger-validity."/>
+    <w:bookmarkEnd w:id="54"/>
+    <w:bookmarkStart w:id="55" w:name="transactional-ledger-validity."/>
     <w:p>
       <w:pPr>
         <w:pStyle w:val="Heading4"/>
@@ -6472,7 +6285,49 @@
         <w:t xml:space="preserve">BEGIN IMMEDIATE</w:t>
       </w:r>
       <w:r>
-        <w:t xml:space="preserve">). JSON rejects</w:t>
+        <w:t xml:space="preserve">). JSON rejects multiprocess transactional</w:t>
+      </w:r>
+      <w:r>
+        <w:t xml:space="preserve"> </w:t>
+      </w:r>
+      <w:r>
+        <w:t xml:space="preserve">mode fail-closed. A PostgreSQL backend with the same semantics is specified</w:t>
+      </w:r>
+      <w:r>
+        <w:t xml:space="preserve"> </w:t>
+      </w:r>
+      <w:r>
+        <w:t xml:space="preserve">but not shipped in Core 4.1.0-rc.6. Contract tests establish integrity checks</w:t>
+      </w:r>
+      <w:r>
+        <w:t xml:space="preserve"> </w:t>
+      </w:r>
+      <w:r>
+        <w:t xml:space="preserve">for the released backends; they do not prove Byzantine fault tolerance or</w:t>
+      </w:r>
+      <w:r>
+        <w:t xml:space="preserve"> </w:t>
+      </w:r>
+      <w:r>
+        <w:t xml:space="preserve">safety under a compromised signing key and unrestricted storage access.</w:t>
+      </w:r>
+    </w:p>
+    <w:bookmarkEnd w:id="55"/>
+    <w:bookmarkStart w:id="56" w:name="grdi-and-replay-validity."/>
+    <w:p>
+      <w:pPr>
+        <w:pStyle w:val="Heading4"/>
+      </w:pPr>
+      <w:r>
+        <w:t xml:space="preserve">GRDI and replay validity.</w:t>
+      </w:r>
+    </w:p>
+    <w:p>
+      <w:pPr>
+        <w:pStyle w:val="FirstParagraph"/>
+      </w:pPr>
+      <w:r>
+        <w:t xml:space="preserve">GRDI records a shadow decision chain with explicit</w:t>
       </w:r>
       <w:r>
         <w:t xml:space="preserve"> </w:t>
@@ -6481,63 +6336,6 @@
         <w:rPr>
           <w:rStyle w:val="VerbatimChar"/>
         </w:rPr>
-        <w:t xml:space="preserve">transactional_mode=multiprocess</w:t>
-      </w:r>
-      <w:r>
-        <w:t xml:space="preserve"> </w:t>
-      </w:r>
-      <w:r>
-        <w:t xml:space="preserve">fail-closed. A PostgreSQL backend</w:t>
-      </w:r>
-      <w:r>
-        <w:t xml:space="preserve"> </w:t>
-      </w:r>
-      <w:r>
-        <w:t xml:space="preserve">with the same semantics is specified but not shipped in Core 4.1.0-rc.6.</w:t>
-      </w:r>
-      <w:r>
-        <w:t xml:space="preserve"> </w:t>
-      </w:r>
-      <w:r>
-        <w:t xml:space="preserve">Contract tests establish integrity checks for the released backends; they do</w:t>
-      </w:r>
-      <w:r>
-        <w:t xml:space="preserve"> </w:t>
-      </w:r>
-      <w:r>
-        <w:t xml:space="preserve">not prove Byzantine fault tolerance or safety under a compromised signing key</w:t>
-      </w:r>
-      <w:r>
-        <w:t xml:space="preserve"> </w:t>
-      </w:r>
-      <w:r>
-        <w:t xml:space="preserve">and unrestricted storage access.</w:t>
-      </w:r>
-    </w:p>
-    <w:bookmarkEnd w:id="54"/>
-    <w:bookmarkStart w:id="55" w:name="grdi-and-replay-validity."/>
-    <w:p>
-      <w:pPr>
-        <w:pStyle w:val="Heading4"/>
-      </w:pPr>
-      <w:r>
-        <w:t xml:space="preserve">GRDI and replay validity.</w:t>
-      </w:r>
-    </w:p>
-    <w:p>
-      <w:pPr>
-        <w:pStyle w:val="FirstParagraph"/>
-      </w:pPr>
-      <w:r>
-        <w:t xml:space="preserve">GRDI records a shadow decision chain with explicit</w:t>
-      </w:r>
-      <w:r>
-        <w:t xml:space="preserve"> </w:t>
-      </w:r>
-      <w:r>
-        <w:rPr>
-          <w:rStyle w:val="VerbatimChar"/>
-        </w:rPr>
         <w:t xml:space="preserve">NOT_EXECUTED</w:t>
       </w:r>
       <w:r>
@@ -6571,8 +6369,8 @@
         <w:t xml:space="preserve">External connectors and live execution remain out of scope.</w:t>
       </w:r>
     </w:p>
-    <w:bookmarkEnd w:id="55"/>
-    <w:bookmarkStart w:id="56" w:name="hav-validity."/>
+    <w:bookmarkEnd w:id="56"/>
+    <w:bookmarkStart w:id="57" w:name="hav-validity."/>
     <w:p>
       <w:pPr>
         <w:pStyle w:val="Heading4"/>
@@ -6663,8 +6461,8 @@
         <w:t xml:space="preserve">documented as an auxiliary signal rather than proof of factual agreement.</w:t>
       </w:r>
     </w:p>
-    <w:bookmarkEnd w:id="56"/>
-    <w:bookmarkStart w:id="57" w:name="causal-and-governance-claims."/>
+    <w:bookmarkEnd w:id="57"/>
+    <w:bookmarkStart w:id="58" w:name="causal-and-governance-claims."/>
     <w:p>
       <w:pPr>
         <w:pStyle w:val="Heading4"/>
@@ -6711,9 +6509,9 @@
         <w:t xml:space="preserve">legal, or correct outcomes.</w:t>
       </w:r>
     </w:p>
-    <w:bookmarkEnd w:id="57"/>
     <w:bookmarkEnd w:id="58"/>
-    <w:bookmarkStart w:id="61" w:name="reproducibility-and-availability"/>
+    <w:bookmarkEnd w:id="59"/>
+    <w:bookmarkStart w:id="62" w:name="reproducibility-and-availability"/>
     <w:p>
       <w:pPr>
         <w:pStyle w:val="Heading1"/>
@@ -6738,7 +6536,7 @@
       <w:r>
         <w:t xml:space="preserve"> </w:t>
       </w:r>
-      <w:hyperlink r:id="rId59">
+      <w:hyperlink r:id="rId60">
         <w:r>
           <w:rPr>
             <w:rStyle w:val="Hyperlink"/>
@@ -6791,7 +6589,7 @@
       <w:r>
         <w:t xml:space="preserve"> </w:t>
       </w:r>
-      <w:hyperlink r:id="rId60">
+      <w:hyperlink r:id="rId61">
         <w:r>
           <w:rPr>
             <w:rStyle w:val="Hyperlink"/>
@@ -6994,7 +6792,7 @@
       <w:r>
         <w:t xml:space="preserve"> </w:t>
       </w:r>
-      <w:hyperlink r:id="rId60">
+      <w:hyperlink r:id="rId61">
         <w:r>
           <w:rPr>
             <w:rStyle w:val="Hyperlink"/>
@@ -7006,8 +6804,8 @@
         <w:t xml:space="preserve">.</w:t>
       </w:r>
     </w:p>
-    <w:bookmarkEnd w:id="61"/>
-    <w:bookmarkStart w:id="62" w:name="ethical-and-operational-considerations"/>
+    <w:bookmarkEnd w:id="62"/>
+    <w:bookmarkStart w:id="63" w:name="ethical-and-operational-considerations"/>
     <w:p>
       <w:pPr>
         <w:pStyle w:val="Heading1"/>
@@ -7072,8 +6870,8 @@
         <w:t xml:space="preserve">finance, health, or critical infrastructure.</w:t>
       </w:r>
     </w:p>
-    <w:bookmarkEnd w:id="62"/>
-    <w:bookmarkStart w:id="63" w:name="conclusion"/>
+    <w:bookmarkEnd w:id="63"/>
+    <w:bookmarkStart w:id="64" w:name="conclusion"/>
     <w:p>
       <w:pPr>
         <w:pStyle w:val="Heading1"/>
@@ -7192,8 +6990,8 @@
         <w:t xml:space="preserve">anchored audit storage, and prospective shadow deployments.</w:t>
       </w:r>
     </w:p>
-    <w:bookmarkEnd w:id="63"/>
-    <w:bookmarkStart w:id="64" w:name="author-contributions"/>
+    <w:bookmarkEnd w:id="64"/>
+    <w:bookmarkStart w:id="65" w:name="author-contributions"/>
     <w:p>
       <w:pPr>
         <w:pStyle w:val="Heading1"/>
@@ -7222,8 +7020,8 @@
         <w:t xml:space="preserve">manuscript.</w:t>
       </w:r>
     </w:p>
-    <w:bookmarkEnd w:id="64"/>
-    <w:bookmarkStart w:id="65" w:name="conflict-of-interest"/>
+    <w:bookmarkEnd w:id="65"/>
+    <w:bookmarkStart w:id="66" w:name="conflict-of-interest"/>
     <w:p>
       <w:pPr>
         <w:pStyle w:val="Heading1"/>
@@ -7252,8 +7050,8 @@
         <w:t xml:space="preserve">The evaluation and limitations are reported to enable independent scrutiny.</w:t>
       </w:r>
     </w:p>
-    <w:bookmarkEnd w:id="65"/>
-    <w:bookmarkStart w:id="91" w:name="license"/>
+    <w:bookmarkEnd w:id="66"/>
+    <w:bookmarkStart w:id="92" w:name="license"/>
     <w:p>
       <w:pPr>
         <w:pStyle w:val="Heading1"/>
@@ -7276,8 +7074,8 @@
         <w:t xml:space="preserve">International License (CC BY 4.0).</w:t>
       </w:r>
     </w:p>
-    <w:bookmarkStart w:id="90" w:name="refs"/>
-    <w:bookmarkStart w:id="67" w:name="ref-battaglia2018relational"/>
+    <w:bookmarkStart w:id="91" w:name="refs"/>
+    <w:bookmarkStart w:id="68" w:name="ref-battaglia2018relational"/>
     <w:p>
       <w:pPr>
         <w:pStyle w:val="Bibliography"/>
@@ -7310,7 +7108,7 @@
       <w:r>
         <w:t xml:space="preserve"> </w:t>
       </w:r>
-      <w:hyperlink r:id="rId66">
+      <w:hyperlink r:id="rId67">
         <w:r>
           <w:rPr>
             <w:rStyle w:val="Hyperlink"/>
@@ -7322,8 +7120,8 @@
         <w:t xml:space="preserve">.</w:t>
       </w:r>
     </w:p>
-    <w:bookmarkEnd w:id="67"/>
-    <w:bookmarkStart w:id="69" w:name="ref-gebru2021datasheets"/>
+    <w:bookmarkEnd w:id="68"/>
+    <w:bookmarkStart w:id="70" w:name="ref-gebru2021datasheets"/>
     <w:p>
       <w:pPr>
         <w:pStyle w:val="Bibliography"/>
@@ -7356,7 +7154,7 @@
       <w:r>
         <w:t xml:space="preserve"> </w:t>
       </w:r>
-      <w:hyperlink r:id="rId68">
+      <w:hyperlink r:id="rId69">
         <w:r>
           <w:rPr>
             <w:rStyle w:val="Hyperlink"/>
@@ -7368,8 +7166,8 @@
         <w:t xml:space="preserve">.</w:t>
       </w:r>
     </w:p>
-    <w:bookmarkEnd w:id="69"/>
-    <w:bookmarkStart w:id="71" w:name="ref-ji2023hallucination"/>
+    <w:bookmarkEnd w:id="70"/>
+    <w:bookmarkStart w:id="72" w:name="ref-ji2023hallucination"/>
     <w:p>
       <w:pPr>
         <w:pStyle w:val="Bibliography"/>
@@ -7402,7 +7200,7 @@
       <w:r>
         <w:t xml:space="preserve"> </w:t>
       </w:r>
-      <w:hyperlink r:id="rId70">
+      <w:hyperlink r:id="rId71">
         <w:r>
           <w:rPr>
             <w:rStyle w:val="Hyperlink"/>
@@ -7414,8 +7212,8 @@
         <w:t xml:space="preserve">.</w:t>
       </w:r>
     </w:p>
-    <w:bookmarkEnd w:id="71"/>
-    <w:bookmarkStart w:id="73" w:name="ref-lanvin2022errors"/>
+    <w:bookmarkEnd w:id="72"/>
+    <w:bookmarkStart w:id="74" w:name="ref-lanvin2022errors"/>
     <w:p>
       <w:pPr>
         <w:pStyle w:val="Bibliography"/>
@@ -7457,7 +7255,7 @@
       <w:r>
         <w:t xml:space="preserve"> </w:t>
       </w:r>
-      <w:hyperlink r:id="rId72">
+      <w:hyperlink r:id="rId73">
         <w:r>
           <w:rPr>
             <w:rStyle w:val="Hyperlink"/>
@@ -7469,8 +7267,8 @@
         <w:t xml:space="preserve">.</w:t>
       </w:r>
     </w:p>
-    <w:bookmarkEnd w:id="73"/>
-    <w:bookmarkStart w:id="75" w:name="ref-lebo2013provo"/>
+    <w:bookmarkEnd w:id="74"/>
+    <w:bookmarkStart w:id="76" w:name="ref-lebo2013provo"/>
     <w:p>
       <w:pPr>
         <w:pStyle w:val="Bibliography"/>
@@ -7529,7 +7327,7 @@
       <w:r>
         <w:t xml:space="preserve"> </w:t>
       </w:r>
-      <w:hyperlink r:id="rId74">
+      <w:hyperlink r:id="rId75">
         <w:r>
           <w:rPr>
             <w:rStyle w:val="Hyperlink"/>
@@ -7541,8 +7339,8 @@
         <w:t xml:space="preserve">.</w:t>
       </w:r>
     </w:p>
-    <w:bookmarkEnd w:id="75"/>
-    <w:bookmarkStart w:id="77" w:name="ref-liu2022errors"/>
+    <w:bookmarkEnd w:id="76"/>
+    <w:bookmarkStart w:id="78" w:name="ref-liu2022errors"/>
     <w:p>
       <w:pPr>
         <w:pStyle w:val="Bibliography"/>
@@ -7605,7 +7403,7 @@
       <w:r>
         <w:t xml:space="preserve"> </w:t>
       </w:r>
-      <w:hyperlink r:id="rId76">
+      <w:hyperlink r:id="rId77">
         <w:r>
           <w:rPr>
             <w:rStyle w:val="Hyperlink"/>
@@ -7617,8 +7415,8 @@
         <w:t xml:space="preserve">.</w:t>
       </w:r>
     </w:p>
-    <w:bookmarkEnd w:id="77"/>
-    <w:bookmarkStart w:id="79" w:name="ref-mitchell2019modelcards"/>
+    <w:bookmarkEnd w:id="78"/>
+    <w:bookmarkStart w:id="80" w:name="ref-mitchell2019modelcards"/>
     <w:p>
       <w:pPr>
         <w:pStyle w:val="Bibliography"/>
@@ -7648,7 +7446,7 @@
       <w:r>
         <w:t xml:space="preserve"> </w:t>
       </w:r>
-      <w:hyperlink r:id="rId78">
+      <w:hyperlink r:id="rId79">
         <w:r>
           <w:rPr>
             <w:rStyle w:val="Hyperlink"/>
@@ -7660,8 +7458,8 @@
         <w:t xml:space="preserve">.</w:t>
       </w:r>
     </w:p>
-    <w:bookmarkEnd w:id="79"/>
-    <w:bookmarkStart w:id="81" w:name="ref-owasp2025agentic"/>
+    <w:bookmarkEnd w:id="80"/>
+    <w:bookmarkStart w:id="82" w:name="ref-owasp2025agentic"/>
     <w:p>
       <w:pPr>
         <w:pStyle w:val="Bibliography"/>
@@ -7685,7 +7483,7 @@
       <w:r>
         <w:t xml:space="preserve"> </w:t>
       </w:r>
-      <w:hyperlink r:id="rId80">
+      <w:hyperlink r:id="rId81">
         <w:r>
           <w:rPr>
             <w:rStyle w:val="Hyperlink"/>
@@ -7697,8 +7495,8 @@
         <w:t xml:space="preserve">.</w:t>
       </w:r>
     </w:p>
-    <w:bookmarkEnd w:id="81"/>
-    <w:bookmarkStart w:id="83" w:name="ref-sharafaldin2018cicids"/>
+    <w:bookmarkEnd w:id="82"/>
+    <w:bookmarkStart w:id="84" w:name="ref-sharafaldin2018cicids"/>
     <w:p>
       <w:pPr>
         <w:pStyle w:val="Bibliography"/>
@@ -7728,7 +7526,7 @@
       <w:r>
         <w:t xml:space="preserve"> </w:t>
       </w:r>
-      <w:hyperlink r:id="rId82">
+      <w:hyperlink r:id="rId83">
         <w:r>
           <w:rPr>
             <w:rStyle w:val="Hyperlink"/>
@@ -7740,8 +7538,8 @@
         <w:t xml:space="preserve">.</w:t>
       </w:r>
     </w:p>
-    <w:bookmarkEnd w:id="83"/>
-    <w:bookmarkStart w:id="85" w:name="ref-nist2023airmf"/>
+    <w:bookmarkEnd w:id="84"/>
+    <w:bookmarkStart w:id="86" w:name="ref-nist2023airmf"/>
     <w:p>
       <w:pPr>
         <w:pStyle w:val="Bibliography"/>
@@ -7786,7 +7584,7 @@
       <w:r>
         <w:t xml:space="preserve"> </w:t>
       </w:r>
-      <w:hyperlink r:id="rId84">
+      <w:hyperlink r:id="rId85">
         <w:r>
           <w:rPr>
             <w:rStyle w:val="Hyperlink"/>
@@ -7798,8 +7596,8 @@
         <w:t xml:space="preserve">.</w:t>
       </w:r>
     </w:p>
-    <w:bookmarkEnd w:id="85"/>
-    <w:bookmarkStart w:id="87" w:name="ref-thorne2018fever"/>
+    <w:bookmarkEnd w:id="86"/>
+    <w:bookmarkStart w:id="88" w:name="ref-thorne2018fever"/>
     <w:p>
       <w:pPr>
         <w:pStyle w:val="Bibliography"/>
@@ -7844,7 +7642,7 @@
       <w:r>
         <w:t xml:space="preserve"> </w:t>
       </w:r>
-      <w:hyperlink r:id="rId86">
+      <w:hyperlink r:id="rId87">
         <w:r>
           <w:rPr>
             <w:rStyle w:val="Hyperlink"/>
@@ -7856,8 +7654,8 @@
         <w:t xml:space="preserve">.</w:t>
       </w:r>
     </w:p>
-    <w:bookmarkEnd w:id="87"/>
-    <w:bookmarkStart w:id="89" w:name="ref-torresarias2019intoto"/>
+    <w:bookmarkEnd w:id="88"/>
+    <w:bookmarkStart w:id="90" w:name="ref-torresarias2019intoto"/>
     <w:p>
       <w:pPr>
         <w:pStyle w:val="Bibliography"/>
@@ -7887,7 +7685,7 @@
       <w:r>
         <w:t xml:space="preserve"> </w:t>
       </w:r>
-      <w:hyperlink r:id="rId88">
+      <w:hyperlink r:id="rId89">
         <w:r>
           <w:rPr>
             <w:rStyle w:val="Hyperlink"/>
@@ -7899,9 +7697,9 @@
         <w:t xml:space="preserve">.</w:t>
       </w:r>
     </w:p>
-    <w:bookmarkEnd w:id="89"/>
     <w:bookmarkEnd w:id="90"/>
     <w:bookmarkEnd w:id="91"/>
+    <w:bookmarkEnd w:id="92"/>
     <w:sectPr>
       <w:footnotePr>
         <w:numRestart w:val="eachSect"/>

</xml_diff>

<commit_message>
docs(paper): tighten §4.3 and GRDI prose for line breaks
Reduce overfull hbox warnings in scoped-ledger and state-separation paragraphs.

Co-authored-by: Cursor <cursoragent@cursor.com>
</commit_message>
<xml_diff>
--- a/paper/main.docx
+++ b/paper/main.docx
@@ -1971,7 +1971,7 @@
         <w:t xml:space="preserve"> </w:t>
       </w:r>
       <w:r>
-        <w:t xml:space="preserve">hash, chain metadata, and row version. The public API exposes</w:t>
+        <w:t xml:space="preserve">hash, chain metadata, and row version. Public scoped operations include</w:t>
       </w:r>
       <w:r>
         <w:t xml:space="preserve"> </w:t>
@@ -2043,7 +2043,7 @@
         <w:t xml:space="preserve">run_scoped_transaction</w:t>
       </w:r>
       <w:r>
-        <w:t xml:space="preserve">. A separate</w:t>
+        <w:t xml:space="preserve">; integrity verification uses</w:t>
       </w:r>
       <w:r>
         <w:t xml:space="preserve"> </w:t>
@@ -2055,16 +2055,13 @@
         <w:t xml:space="preserve">verify_scoped_chain</w:t>
       </w:r>
       <w:r>
-        <w:t xml:space="preserve"> </w:t>
-      </w:r>
-      <w:r>
-        <w:t xml:space="preserve">operation recomputes hashes, chain continuity, and chain-head consistency</w:t>
-      </w:r>
-      <w:r>
-        <w:t xml:space="preserve"> </w:t>
-      </w:r>
-      <w:r>
-        <w:t xml:space="preserve">without repairing data.</w:t>
+        <w:t xml:space="preserve">, which recomputes hashes, chain continuity, and</w:t>
+      </w:r>
+      <w:r>
+        <w:t xml:space="preserve"> </w:t>
+      </w:r>
+      <w:r>
+        <w:t xml:space="preserve">chain-head consistency without repairing data.</w:t>
       </w:r>
     </w:p>
     <w:bookmarkStart w:id="20" w:name="write-locks."/>
@@ -2197,7 +2194,19 @@
         <w:t xml:space="preserve"> </w:t>
       </w:r>
       <w:r>
-        <w:t xml:space="preserve">staged in thread-local state and flushed on success;</w:t>
+        <w:t xml:space="preserve">staged in thread-local state and flushed on success. JSON rejects multiprocess</w:t>
+      </w:r>
+      <w:r>
+        <w:t xml:space="preserve"> </w:t>
+      </w:r>
+      <w:r>
+        <w:t xml:space="preserve">transactional mode fail-closed because cross-process file locking is not</w:t>
+      </w:r>
+      <w:r>
+        <w:t xml:space="preserve"> </w:t>
+      </w:r>
+      <w:r>
+        <w:t xml:space="preserve">provided. On SQLite, the engine uses</w:t>
       </w:r>
       <w:r>
         <w:t xml:space="preserve"> </w:t>
@@ -2206,34 +2215,19 @@
         <w:rPr>
           <w:rStyle w:val="VerbatimChar"/>
         </w:rPr>
-        <w:t xml:space="preserve">transactional_mode=multiprocess</w:t>
-      </w:r>
-      <w:r>
-        <w:t xml:space="preserve"> </w:t>
-      </w:r>
-      <w:r>
-        <w:t xml:space="preserve">is rejected fail-closed because</w:t>
-      </w:r>
-      <w:r>
-        <w:t xml:space="preserve"> </w:t>
-      </w:r>
-      <w:r>
-        <w:t xml:space="preserve">cross-process file locking is not provided. On SQLite, the engine uses</w:t>
-      </w:r>
-      <w:r>
-        <w:t xml:space="preserve"> </w:t>
-      </w:r>
-      <w:r>
-        <w:rPr>
-          <w:rStyle w:val="VerbatimChar"/>
-        </w:rPr>
         <w:t xml:space="preserve">BEGIN IMMEDIATE</w:t>
       </w:r>
       <w:r>
         <w:t xml:space="preserve"> </w:t>
       </w:r>
       <w:r>
-        <w:t xml:space="preserve">with scoped tables</w:t>
+        <w:t xml:space="preserve">with scoped</w:t>
+      </w:r>
+      <w:r>
+        <w:t xml:space="preserve"> </w:t>
+      </w:r>
+      <w:r>
+        <w:t xml:space="preserve">tables</w:t>
       </w:r>
       <w:r>
         <w:t xml:space="preserve"> </w:t>
@@ -4294,7 +4288,10 @@
         <w:pStyle w:val="FirstParagraph"/>
       </w:pPr>
       <w:r>
-        <w:t xml:space="preserve">Verification (</w:t>
+        <w:t xml:space="preserve">Verification uses</w:t>
+      </w:r>
+      <w:r>
+        <w:t xml:space="preserve"> </w:t>
       </w:r>
       <w:r>
         <w:rPr>
@@ -4306,7 +4303,7 @@
         <w:t xml:space="preserve"> </w:t>
       </w:r>
       <w:r>
-        <w:t xml:space="preserve">/</w:t>
+        <w:t xml:space="preserve">or</w:t>
       </w:r>
       <w:r>
         <w:t xml:space="preserve"> </w:t>
@@ -4318,13 +4315,16 @@
         <w:t xml:space="preserve">NOT_VERIFIED</w:t>
       </w:r>
       <w:r>
-        <w:t xml:space="preserve">), authorization</w:t>
-      </w:r>
-      <w:r>
-        <w:t xml:space="preserve"> </w:t>
-      </w:r>
-      <w:r>
-        <w:t xml:space="preserve">(</w:t>
+        <w:t xml:space="preserve">; authorization</w:t>
+      </w:r>
+      <w:r>
+        <w:t xml:space="preserve"> </w:t>
+      </w:r>
+      <w:r>
+        <w:t xml:space="preserve">uses</w:t>
+      </w:r>
+      <w:r>
+        <w:t xml:space="preserve"> </w:t>
       </w:r>
       <w:r>
         <w:rPr>
@@ -4357,7 +4357,10 @@
         <w:t xml:space="preserve">REQUIRES_APPROVAL</w:t>
       </w:r>
       <w:r>
-        <w:t xml:space="preserve">), and execution (</w:t>
+        <w:t xml:space="preserve">; execution remains</w:t>
+      </w:r>
+      <w:r>
+        <w:t xml:space="preserve"> </w:t>
       </w:r>
       <w:r>
         <w:rPr>
@@ -4369,25 +4372,25 @@
         <w:t xml:space="preserve"> </w:t>
       </w:r>
       <w:r>
-        <w:t xml:space="preserve">throughout Foundation and shadow increments) are stored as distinct fields.</w:t>
-      </w:r>
-      <w:r>
-        <w:t xml:space="preserve"> </w:t>
-      </w:r>
-      <w:r>
-        <w:t xml:space="preserve">A passing HAV receipt does not by itself authorize an action; an authorized</w:t>
-      </w:r>
-      <w:r>
-        <w:t xml:space="preserve"> </w:t>
-      </w:r>
-      <w:r>
-        <w:t xml:space="preserve">envelope does not imply that an external action was executed. The shadow</w:t>
-      </w:r>
-      <w:r>
-        <w:t xml:space="preserve"> </w:t>
-      </w:r>
-      <w:r>
-        <w:t xml:space="preserve">execution gateway may record</w:t>
+        <w:t xml:space="preserve">throughout Foundation and shadow increments. These states are stored as</w:t>
+      </w:r>
+      <w:r>
+        <w:t xml:space="preserve"> </w:t>
+      </w:r>
+      <w:r>
+        <w:t xml:space="preserve">distinct fields. A passing HAV receipt does not by itself authorize an action;</w:t>
+      </w:r>
+      <w:r>
+        <w:t xml:space="preserve"> </w:t>
+      </w:r>
+      <w:r>
+        <w:t xml:space="preserve">an authorized envelope does not imply that an external action was executed.</w:t>
+      </w:r>
+      <w:r>
+        <w:t xml:space="preserve"> </w:t>
+      </w:r>
+      <w:r>
+        <w:t xml:space="preserve">The shadow execution gateway may record</w:t>
       </w:r>
       <w:r>
         <w:t xml:space="preserve"> </w:t>
@@ -4402,13 +4405,13 @@
         <w:t xml:space="preserve"> </w:t>
       </w:r>
       <w:r>
-        <w:t xml:space="preserve">plans and signed receipts</w:t>
-      </w:r>
-      <w:r>
-        <w:t xml:space="preserve"> </w:t>
-      </w:r>
-      <w:r>
-        <w:t xml:space="preserve">while preserving</w:t>
+        <w:t xml:space="preserve">plans and signed</w:t>
+      </w:r>
+      <w:r>
+        <w:t xml:space="preserve"> </w:t>
+      </w:r>
+      <w:r>
+        <w:t xml:space="preserve">receipts while preserving</w:t>
       </w:r>
       <w:r>
         <w:t xml:space="preserve"> </w:t>

</xml_diff>

<commit_message>
docs(paper): update Fig. 2 scoped labels and expand RQs to five
Label protocol lifecycle with scoped collections; align abstract and evaluation subsections with RQ1–RQ5 (integrity, replay, HAV, anomaly).

Co-authored-by: Cursor <cursoragent@cursor.com>
</commit_message>
<xml_diff>
--- a/paper/main.docx
+++ b/paper/main.docx
@@ -208,7 +208,13 @@
         <w:t xml:space="preserve"> </w:t>
       </w:r>
       <w:r>
-        <w:t xml:space="preserve">HAV-specific tests); continuous integration targets Python 3.10–3.13. An</w:t>
+        <w:t xml:space="preserve">HAV-specific tests), including scoped-integrity, idempotent append-once, and</w:t>
+      </w:r>
+      <w:r>
+        <w:t xml:space="preserve"> </w:t>
+      </w:r>
+      <w:r>
+        <w:t xml:space="preserve">GRDI replay-audit cases; continuous integration targets Python 3.10–3.13. An</w:t>
       </w:r>
       <w:r>
         <w:t xml:space="preserve"> </w:t>
@@ -1546,7 +1552,36 @@
         <w:t xml:space="preserve"> </w:t>
       </w:r>
       <w:r>
-        <w:t xml:space="preserve">enforcement gap, not a guarantee supplied by the protocol. Figure</w:t>
+        <w:t xml:space="preserve">enforcement gap, not a guarantee supplied by the protocol. In Core 4.1, each</w:t>
+      </w:r>
+      <w:r>
+        <w:t xml:space="preserve"> </w:t>
+      </w:r>
+      <w:r>
+        <w:t xml:space="preserve">record type maps to a tenant- and project-scoped collection: protocol records</w:t>
+      </w:r>
+      <w:r>
+        <w:t xml:space="preserve"> </w:t>
+      </w:r>
+      <w:r>
+        <w:t xml:space="preserve">use mutable scoped rows, while GRDI stages use chain-linked append-only</w:t>
+      </w:r>
+      <w:r>
+        <w:t xml:space="preserve"> </w:t>
+      </w:r>
+      <w:r>
+        <w:t xml:space="preserve">collections (Section </w:t>
+      </w:r>
+      <w:hyperlink w:anchor="sec:transactional-ledger">
+        <w:r>
+          <w:rPr>
+            <w:rStyle w:val="Hyperlink"/>
+          </w:rPr>
+          <w:t xml:space="preserve">4.3</w:t>
+        </w:r>
+      </w:hyperlink>
+      <w:r>
+        <w:t xml:space="preserve">). Figure</w:t>
       </w:r>
       <w:r>
         <w:t xml:space="preserve"> </w:t>
@@ -1617,7 +1652,13 @@
         <w:t xml:space="preserve"> </w:t>
       </w:r>
       <w:r>
-        <w:t xml:space="preserve">new evidence for future claims. The cycle is auditable, not automatic –</w:t>
+        <w:t xml:space="preserve">new evidence for future claims. Under Core 4.1, each record type is persisted</w:t>
+      </w:r>
+      <w:r>
+        <w:t xml:space="preserve"> </w:t>
+      </w:r>
+      <w:r>
+        <w:t xml:space="preserve">in a scope-tagged collection. The cycle is auditable, not automatic –</w:t>
       </w:r>
       <w:r>
         <w:t xml:space="preserve"> </w:t>
@@ -4821,7 +4862,7 @@
         <w:pStyle w:val="FirstParagraph"/>
       </w:pPr>
       <w:r>
-        <w:t xml:space="preserve">The evaluation addresses three bounded questions:</w:t>
+        <w:t xml:space="preserve">The evaluation addresses five bounded questions:</w:t>
       </w:r>
     </w:p>
     <w:p>
@@ -4829,13 +4870,13 @@
         <w:pStyle w:val="BodyText"/>
       </w:pPr>
       <w:r>
-        <w:t xml:space="preserve">Is the software version mechanically testable across its supported Python</w:t>
-      </w:r>
-      <w:r>
-        <w:t xml:space="preserve"> </w:t>
-      </w:r>
-      <w:r>
-        <w:t xml:space="preserve">versions and packaging paths?</w:t>
+        <w:t xml:space="preserve">Is the software version mechanically testable across its supported</w:t>
+      </w:r>
+      <w:r>
+        <w:t xml:space="preserve"> </w:t>
+      </w:r>
+      <w:r>
+        <w:t xml:space="preserve">Python versions and packaging paths?</w:t>
       </w:r>
     </w:p>
     <w:p>
@@ -4843,6 +4884,75 @@
         <w:pStyle w:val="BodyText"/>
       </w:pPr>
       <w:r>
+        <w:t xml:space="preserve">Do the scoped transactional backends enforce declared write locks,</w:t>
+      </w:r>
+      <w:r>
+        <w:t xml:space="preserve"> </w:t>
+      </w:r>
+      <w:r>
+        <w:t xml:space="preserve">idempotent append-once semantics, and fail-closed</w:t>
+      </w:r>
+      <w:r>
+        <w:t xml:space="preserve"> </w:t>
+      </w:r>
+      <w:r>
+        <w:rPr>
+          <w:rStyle w:val="VerbatimChar"/>
+        </w:rPr>
+        <w:t xml:space="preserve">verify_scoped_chain</w:t>
+      </w:r>
+      <w:r>
+        <w:t xml:space="preserve"> </w:t>
+      </w:r>
+      <w:r>
+        <w:t xml:space="preserve">behavior on JSON and SQLite?</w:t>
+      </w:r>
+    </w:p>
+    <w:p>
+      <w:pPr>
+        <w:pStyle w:val="BodyText"/>
+      </w:pPr>
+      <w:r>
+        <w:t xml:space="preserve">Does GRDI replay audit deterministically verify persisted shadow</w:t>
+      </w:r>
+      <w:r>
+        <w:t xml:space="preserve"> </w:t>
+      </w:r>
+      <w:r>
+        <w:t xml:space="preserve">chains without re-simulation or external connector invocation?</w:t>
+      </w:r>
+    </w:p>
+    <w:p>
+      <w:pPr>
+        <w:pStyle w:val="BodyText"/>
+      </w:pPr>
+      <w:r>
+        <w:t xml:space="preserve">Does the HAV fail-closed policy produce the intended blocking or</w:t>
+      </w:r>
+      <w:r>
+        <w:t xml:space="preserve"> </w:t>
+      </w:r>
+      <w:r>
+        <w:t xml:space="preserve">passing behavior on hand-constructed scenarios covering a contradicted</w:t>
+      </w:r>
+      <w:r>
+        <w:t xml:space="preserve"> </w:t>
+      </w:r>
+      <w:r>
+        <w:t xml:space="preserve">critical claim, an unavailable authoritative source, and a supported</w:t>
+      </w:r>
+      <w:r>
+        <w:t xml:space="preserve"> </w:t>
+      </w:r>
+      <w:r>
+        <w:t xml:space="preserve">numeric claim?</w:t>
+      </w:r>
+    </w:p>
+    <w:p>
+      <w:pPr>
+        <w:pStyle w:val="BodyText"/>
+      </w:pPr>
+      <w:r>
         <w:t xml:space="preserve">Does the current relational anomaly score produce useful rankings</w:t>
       </w:r>
       <w:r>
@@ -4863,32 +4973,6 @@
         <w:pStyle w:val="BodyText"/>
       </w:pPr>
       <w:r>
-        <w:t xml:space="preserve">Does the HAV fail-closed policy produce the intended blocking or</w:t>
-      </w:r>
-      <w:r>
-        <w:t xml:space="preserve"> </w:t>
-      </w:r>
-      <w:r>
-        <w:t xml:space="preserve">passing behavior on hand-constructed scenarios covering a contradicted</w:t>
-      </w:r>
-      <w:r>
-        <w:t xml:space="preserve"> </w:t>
-      </w:r>
-      <w:r>
-        <w:t xml:space="preserve">critical claim, an unavailable authoritative source, and a supported</w:t>
-      </w:r>
-      <w:r>
-        <w:t xml:space="preserve"> </w:t>
-      </w:r>
-      <w:r>
-        <w:t xml:space="preserve">numeric claim?</w:t>
-      </w:r>
-    </w:p>
-    <w:p>
-      <w:pPr>
-        <w:pStyle w:val="BodyText"/>
-      </w:pPr>
-      <w:r>
         <w:t xml:space="preserve">It does not test whether PhiGraph prevents all unsafe agent actions, proves</w:t>
       </w:r>
       <w:r>
@@ -4901,13 +4985,13 @@
         <w:t xml:space="preserve"> </w:t>
       </w:r>
       <w:r>
-        <w:t xml:space="preserve">systems, or measures HAV’s claim-extraction accuracy against a labeled claim</w:t>
-      </w:r>
-      <w:r>
-        <w:t xml:space="preserve"> </w:t>
-      </w:r>
-      <w:r>
-        <w:t xml:space="preserve">corpus.</w:t>
+        <w:t xml:space="preserve">systems, measures HAV’s claim-extraction accuracy against a labeled claim</w:t>
+      </w:r>
+      <w:r>
+        <w:t xml:space="preserve"> </w:t>
+      </w:r>
+      <w:r>
+        <w:t xml:space="preserve">corpus, or establishes Byzantine fault tolerance for scoped storage.</w:t>
       </w:r>
     </w:p>
     <w:bookmarkEnd w:id="43"/>
@@ -4925,7 +5009,7 @@
         <w:pStyle w:val="FirstParagraph"/>
       </w:pPr>
       <w:r>
-        <w:t xml:space="preserve">The software tree contains 319 automated tests at commit</w:t>
+        <w:t xml:space="preserve">To address RQ1, the software tree contains 319 automated tests at commit</w:t>
       </w:r>
       <w:r>
         <w:t xml:space="preserve"> </w:t>
@@ -5048,7 +5132,7 @@
         <w:pStyle w:val="FirstParagraph"/>
       </w:pPr>
       <w:r>
-        <w:t xml:space="preserve">To address RQ3, we exercised the running HAV API with three scenarios chosen</w:t>
+        <w:t xml:space="preserve">To address RQ4, we exercised the running HAV API with three scenarios chosen</w:t>
       </w:r>
       <w:r>
         <w:t xml:space="preserve"> </w:t>
@@ -5224,42 +5308,31 @@
         <w:pStyle w:val="FirstParagraph"/>
       </w:pPr>
       <w:r>
-        <w:t xml:space="preserve">To exercise the scoped API introduced in Section </w:t>
-      </w:r>
-      <w:hyperlink w:anchor="sec:transactional-ledger">
-        <w:r>
-          <w:rPr>
-            <w:rStyle w:val="Hyperlink"/>
-          </w:rPr>
-          <w:t xml:space="preserve">4.3</w:t>
-        </w:r>
-      </w:hyperlink>
-      <w:r>
-        <w:t xml:space="preserve">,</w:t>
-      </w:r>
-      <w:r>
-        <w:t xml:space="preserve"> </w:t>
-      </w:r>
-      <w:r>
-        <w:t xml:space="preserve">the repository includes 57 contract tests (JSON and SQLite) covering idempotent</w:t>
-      </w:r>
-      <w:r>
-        <w:t xml:space="preserve"> </w:t>
-      </w:r>
-      <w:r>
-        <w:t xml:space="preserve">append-once under concurrency, undeclared-lock rejection, thread-local JSON</w:t>
-      </w:r>
-      <w:r>
-        <w:t xml:space="preserve"> </w:t>
-      </w:r>
-      <w:r>
-        <w:t xml:space="preserve">transaction isolation, compare-and-set on mutable Core collections without</w:t>
-      </w:r>
-      <w:r>
-        <w:t xml:space="preserve"> </w:t>
-      </w:r>
-      <w:r>
-        <w:t xml:space="preserve">breaking append-only GRDI chains, commit-failure cleanup, and adversarial</w:t>
+        <w:t xml:space="preserve">To address RQ2, the repository includes 57 contract tests (JSON and SQLite)</w:t>
+      </w:r>
+      <w:r>
+        <w:t xml:space="preserve"> </w:t>
+      </w:r>
+      <w:r>
+        <w:t xml:space="preserve">covering idempotent append-once under concurrency, undeclared-lock rejection,</w:t>
+      </w:r>
+      <w:r>
+        <w:t xml:space="preserve"> </w:t>
+      </w:r>
+      <w:r>
+        <w:t xml:space="preserve">thread-local JSON transaction isolation, compare-and-set on mutable Core</w:t>
+      </w:r>
+      <w:r>
+        <w:t xml:space="preserve"> </w:t>
+      </w:r>
+      <w:r>
+        <w:t xml:space="preserve">collections without breaking append-only GRDI chains, commit-failure cleanup,</w:t>
+      </w:r>
+      <w:r>
+        <w:t xml:space="preserve"> </w:t>
+      </w:r>
+      <w:r>
+        <w:t xml:space="preserve">and adversarial</w:t>
       </w:r>
       <w:r>
         <w:t xml:space="preserve"> </w:t>
@@ -5274,19 +5347,19 @@
         <w:t xml:space="preserve"> </w:t>
       </w:r>
       <w:r>
-        <w:t xml:space="preserve">cases (missing heads, orphan heads, sequence</w:t>
-      </w:r>
-      <w:r>
-        <w:t xml:space="preserve"> </w:t>
-      </w:r>
-      <w:r>
-        <w:t xml:space="preserve">gaps, column tampering, and coordinated metadata manipulation; see</w:t>
-      </w:r>
-      <w:r>
-        <w:t xml:space="preserve"> </w:t>
-      </w:r>
-      <w:r>
-        <w:t xml:space="preserve">Figure </w:t>
+        <w:t xml:space="preserve">cases (missing heads, orphan</w:t>
+      </w:r>
+      <w:r>
+        <w:t xml:space="preserve"> </w:t>
+      </w:r>
+      <w:r>
+        <w:t xml:space="preserve">heads, sequence gaps, column tampering, and coordinated metadata manipulation;</w:t>
+      </w:r>
+      <w:r>
+        <w:t xml:space="preserve"> </w:t>
+      </w:r>
+      <w:r>
+        <w:t xml:space="preserve">see Figure </w:t>
       </w:r>
       <w:hyperlink w:anchor="fig:verify-scoped-chain">
         <w:r>
@@ -5313,19 +5386,19 @@
         <w:t xml:space="preserve"> </w:t>
       </w:r>
       <w:r>
-        <w:t xml:space="preserve">integrity behavior for the shipped backends; they</w:t>
-      </w:r>
-      <w:r>
-        <w:t xml:space="preserve"> </w:t>
-      </w:r>
-      <w:r>
-        <w:t xml:space="preserve">do not prove security against a privileged attacker with signing keys and</w:t>
-      </w:r>
-      <w:r>
-        <w:t xml:space="preserve"> </w:t>
-      </w:r>
-      <w:r>
-        <w:t xml:space="preserve">unrestricted storage access.</w:t>
+        <w:t xml:space="preserve">integrity behavior for the shipped backends; they do not</w:t>
+      </w:r>
+      <w:r>
+        <w:t xml:space="preserve"> </w:t>
+      </w:r>
+      <w:r>
+        <w:t xml:space="preserve">prove security against a privileged attacker with signing keys and unrestricted</w:t>
+      </w:r>
+      <w:r>
+        <w:t xml:space="preserve"> </w:t>
+      </w:r>
+      <w:r>
+        <w:t xml:space="preserve">storage access.</w:t>
       </w:r>
     </w:p>
     <w:bookmarkEnd w:id="46"/>
@@ -5343,19 +5416,19 @@
         <w:pStyle w:val="FirstParagraph"/>
       </w:pPr>
       <w:r>
-        <w:t xml:space="preserve">GRDI replay and historical-comparison modules are covered by automated tests</w:t>
-      </w:r>
-      <w:r>
-        <w:t xml:space="preserve"> </w:t>
-      </w:r>
-      <w:r>
-        <w:t xml:space="preserve">that rebuild manifest hashes from persisted shadow records, reject tampered</w:t>
-      </w:r>
-      <w:r>
-        <w:t xml:space="preserve"> </w:t>
-      </w:r>
-      <w:r>
-        <w:t xml:space="preserve">receipt links, and assert explicit non-execution invariants</w:t>
+        <w:t xml:space="preserve">To address RQ3, GRDI replay and historical-comparison modules are covered by</w:t>
+      </w:r>
+      <w:r>
+        <w:t xml:space="preserve"> </w:t>
+      </w:r>
+      <w:r>
+        <w:t xml:space="preserve">automated tests that rebuild manifest hashes from persisted shadow records,</w:t>
+      </w:r>
+      <w:r>
+        <w:t xml:space="preserve"> </w:t>
+      </w:r>
+      <w:r>
+        <w:t xml:space="preserve">reject tampered receipt links, and assert explicit non-execution invariants</w:t>
       </w:r>
       <w:r>
         <w:t xml:space="preserve"> </w:t>
@@ -5434,13 +5507,13 @@
         <w:pStyle w:val="FirstParagraph"/>
       </w:pPr>
       <w:r>
-        <w:t xml:space="preserve">The committed external-validation artifact uses the CIC-IDS2017 Friday</w:t>
-      </w:r>
-      <w:r>
-        <w:t xml:space="preserve"> </w:t>
-      </w:r>
-      <w:r>
-        <w:t xml:space="preserve">afternoon DDoS flow file</w:t>
+        <w:t xml:space="preserve">To address RQ5, the committed external-validation artifact uses the CIC-IDS2017</w:t>
+      </w:r>
+      <w:r>
+        <w:t xml:space="preserve"> </w:t>
+      </w:r>
+      <w:r>
+        <w:t xml:space="preserve">Friday afternoon DDoS flow file</w:t>
       </w:r>
       <w:r>
         <w:t xml:space="preserve"> </w:t>

</xml_diff>